<commit_message>
Actualizar documentación presentación hito 2 - semana 10
</commit_message>
<xml_diff>
--- a/Fase 2/Evidencias Proyecto/Evidencias de documentación/Ev. Daily Meeting.docx
+++ b/Fase 2/Evidencias Proyecto/Evidencias de documentación/Ev. Daily Meeting.docx
@@ -8077,6 +8077,7 @@
               <w:rPr>
                 <w:rtl w:val="0"/>
               </w:rPr>
+              <w:t xml:space="preserve">Documentación técnica</w:t>
             </w:r>
           </w:p>
         </w:tc>
@@ -8133,6 +8134,7 @@
               <w:rPr>
                 <w:rtl w:val="0"/>
               </w:rPr>
+              <w:t xml:space="preserve">Preparar documentación presentación</w:t>
             </w:r>
           </w:p>
         </w:tc>
@@ -8348,6 +8350,7 @@
               <w:rPr>
                 <w:rtl w:val="0"/>
               </w:rPr>
+              <w:t xml:space="preserve">Preparar documentación presentación</w:t>
             </w:r>
           </w:p>
         </w:tc>
@@ -8404,6 +8407,7 @@
               <w:rPr>
                 <w:rtl w:val="0"/>
               </w:rPr>
+              <w:t xml:space="preserve">Finalizar documentación presentación</w:t>
             </w:r>
           </w:p>
         </w:tc>
@@ -8619,6 +8623,7 @@
               <w:rPr>
                 <w:rtl w:val="0"/>
               </w:rPr>
+              <w:t xml:space="preserve">No Aplica</w:t>
             </w:r>
           </w:p>
         </w:tc>
@@ -8675,6 +8680,7 @@
               <w:rPr>
                 <w:rtl w:val="0"/>
               </w:rPr>
+              <w:t xml:space="preserve">No Aplica</w:t>
             </w:r>
           </w:p>
         </w:tc>
@@ -8890,6 +8896,7 @@
               <w:rPr>
                 <w:rtl w:val="0"/>
               </w:rPr>
+              <w:t xml:space="preserve">No Aplica</w:t>
             </w:r>
           </w:p>
         </w:tc>
@@ -8946,6 +8953,7 @@
               <w:rPr>
                 <w:rtl w:val="0"/>
               </w:rPr>
+              <w:t xml:space="preserve">No Aplica</w:t>
             </w:r>
           </w:p>
         </w:tc>
@@ -9076,6 +9084,2772 @@
                 <w:rtl w:val="0"/>
               </w:rPr>
               <w:t xml:space="preserve">Fecha: 10-10-2026</w:t>
+            </w:r>
+          </w:p>
+        </w:tc>
+        <w:tc>
+          <w:tcPr>
+            <w:shd w:fill="cfe2f3" w:val="clear"/>
+            <w:tcMar>
+              <w:top w:w="28.34645669291339" w:type="dxa"/>
+              <w:left w:w="28.34645669291339" w:type="dxa"/>
+              <w:bottom w:w="28.34645669291339" w:type="dxa"/>
+              <w:right w:w="28.34645669291339" w:type="dxa"/>
+            </w:tcMar>
+          </w:tcPr>
+          <w:p>
+            <w:pPr>
+              <w:widowControl w:val="0"/>
+              <w:spacing w:line="240" w:lineRule="auto"/>
+              <w:rPr>
+                <w:b w:val="1"/>
+                <w:bCs w:val="1"/>
+              </w:rPr>
+            </w:pPr>
+            <w:r>
+              <w:rPr>
+                <w:b w:val="1"/>
+                <w:bCs w:val="1"/>
+                <w:rtl w:val="0"/>
+              </w:rPr>
+              <w:t xml:space="preserve">Sprint: 2</w:t>
+            </w:r>
+          </w:p>
+        </w:tc>
+      </w:tr>
+      <w:tr>
+        <w:trPr>
+          <w:cantSplit w:val="1"/>
+          <w:tblHeader w:val="0"/>
+        </w:trPr>
+        <w:tc>
+          <w:tcPr>
+            <w:tcMar>
+              <w:top w:w="28.34645669291339" w:type="dxa"/>
+              <w:left w:w="28.34645669291339" w:type="dxa"/>
+              <w:bottom w:w="28.34645669291339" w:type="dxa"/>
+              <w:right w:w="28.34645669291339" w:type="dxa"/>
+            </w:tcMar>
+          </w:tcPr>
+          <w:p>
+            <w:pPr>
+              <w:widowControl w:val="0"/>
+              <w:spacing w:line="240" w:lineRule="auto"/>
+              <w:rPr>
+                <w:b w:val="1"/>
+                <w:bCs w:val="1"/>
+              </w:rPr>
+            </w:pPr>
+            <w:r>
+              <w:rPr>
+                <w:b w:val="1"/>
+                <w:bCs w:val="1"/>
+                <w:rtl w:val="0"/>
+              </w:rPr>
+              <w:t xml:space="preserve">Que se hizo</w:t>
+            </w:r>
+          </w:p>
+        </w:tc>
+        <w:tc>
+          <w:tcPr>
+            <w:tcMar>
+              <w:top w:w="28.34645669291339" w:type="dxa"/>
+              <w:left w:w="28.34645669291339" w:type="dxa"/>
+              <w:bottom w:w="28.34645669291339" w:type="dxa"/>
+              <w:right w:w="28.34645669291339" w:type="dxa"/>
+            </w:tcMar>
+          </w:tcPr>
+          <w:p>
+            <w:pPr>
+              <w:widowControl w:val="0"/>
+              <w:spacing w:line="240" w:lineRule="auto"/>
+              <w:rPr/>
+            </w:pPr>
+            <w:r>
+              <w:rPr>
+                <w:rtl w:val="0"/>
+              </w:rPr>
+              <w:t xml:space="preserve">No Aplica</w:t>
+            </w:r>
+          </w:p>
+        </w:tc>
+      </w:tr>
+      <w:tr>
+        <w:trPr>
+          <w:cantSplit w:val="1"/>
+          <w:tblHeader w:val="0"/>
+        </w:trPr>
+        <w:tc>
+          <w:tcPr>
+            <w:tcMar>
+              <w:top w:w="28.34645669291339" w:type="dxa"/>
+              <w:left w:w="28.34645669291339" w:type="dxa"/>
+              <w:bottom w:w="28.34645669291339" w:type="dxa"/>
+              <w:right w:w="28.34645669291339" w:type="dxa"/>
+            </w:tcMar>
+          </w:tcPr>
+          <w:p>
+            <w:pPr>
+              <w:widowControl w:val="0"/>
+              <w:spacing w:line="240" w:lineRule="auto"/>
+              <w:rPr>
+                <w:b w:val="1"/>
+                <w:bCs w:val="1"/>
+              </w:rPr>
+            </w:pPr>
+            <w:r>
+              <w:rPr>
+                <w:b w:val="1"/>
+                <w:bCs w:val="1"/>
+                <w:rtl w:val="0"/>
+              </w:rPr>
+              <w:t xml:space="preserve">Que se hará</w:t>
+            </w:r>
+          </w:p>
+        </w:tc>
+        <w:tc>
+          <w:tcPr>
+            <w:tcMar>
+              <w:top w:w="28.34645669291339" w:type="dxa"/>
+              <w:left w:w="28.34645669291339" w:type="dxa"/>
+              <w:bottom w:w="28.34645669291339" w:type="dxa"/>
+              <w:right w:w="28.34645669291339" w:type="dxa"/>
+            </w:tcMar>
+          </w:tcPr>
+          <w:p>
+            <w:pPr>
+              <w:widowControl w:val="0"/>
+              <w:spacing w:line="240" w:lineRule="auto"/>
+              <w:rPr/>
+            </w:pPr>
+            <w:r>
+              <w:rPr>
+                <w:rtl w:val="0"/>
+              </w:rPr>
+              <w:t xml:space="preserve">Migración ubicación carpeta proyecto, Implementación otro tipo de servicios, modificaciones tipografía</w:t>
+            </w:r>
+          </w:p>
+        </w:tc>
+      </w:tr>
+      <w:tr>
+        <w:trPr>
+          <w:cantSplit w:val="1"/>
+          <w:tblHeader w:val="0"/>
+        </w:trPr>
+        <w:tc>
+          <w:tcPr>
+            <w:tcMar>
+              <w:top w:w="28.34645669291339" w:type="dxa"/>
+              <w:left w:w="28.34645669291339" w:type="dxa"/>
+              <w:bottom w:w="28.34645669291339" w:type="dxa"/>
+              <w:right w:w="28.34645669291339" w:type="dxa"/>
+            </w:tcMar>
+          </w:tcPr>
+          <w:p>
+            <w:pPr>
+              <w:widowControl w:val="0"/>
+              <w:spacing w:line="240" w:lineRule="auto"/>
+              <w:rPr>
+                <w:b w:val="1"/>
+                <w:bCs w:val="1"/>
+              </w:rPr>
+            </w:pPr>
+            <w:r>
+              <w:rPr>
+                <w:b w:val="1"/>
+                <w:bCs w:val="1"/>
+                <w:rtl w:val="0"/>
+              </w:rPr>
+              <w:t xml:space="preserve">Impedimentos</w:t>
+            </w:r>
+          </w:p>
+        </w:tc>
+        <w:tc>
+          <w:tcPr>
+            <w:tcMar>
+              <w:top w:w="28.34645669291339" w:type="dxa"/>
+              <w:left w:w="28.34645669291339" w:type="dxa"/>
+              <w:bottom w:w="28.34645669291339" w:type="dxa"/>
+              <w:right w:w="28.34645669291339" w:type="dxa"/>
+            </w:tcMar>
+          </w:tcPr>
+          <w:p>
+            <w:pPr>
+              <w:widowControl w:val="0"/>
+              <w:spacing w:line="240" w:lineRule="auto"/>
+              <w:rPr/>
+            </w:pPr>
+            <w:r>
+              <w:rPr>
+                <w:rtl w:val="0"/>
+              </w:rPr>
+              <w:t xml:space="preserve">No Aplica</w:t>
+            </w:r>
+          </w:p>
+        </w:tc>
+      </w:tr>
+    </w:tbl>
+    <w:p>
+      <w:pPr>
+        <w:rPr/>
+      </w:pPr>
+      <w:r>
+        <w:rPr>
+          <w:rtl w:val="0"/>
+        </w:rPr>
+      </w:r>
+    </w:p>
+    <w:tbl>
+      <w:tblPr>
+        <w:tblStyle w:val="Table34"/>
+        <w:tblW w:w="8503.937007874018" w:type="dxa"/>
+        <w:jc w:val="center"/>
+        <w:tblBorders>
+          <w:top w:color="000000" w:space="0" w:sz="8" w:val="single"/>
+          <w:left w:color="000000" w:space="0" w:sz="8" w:val="single"/>
+          <w:bottom w:color="000000" w:space="0" w:sz="8" w:val="single"/>
+          <w:right w:color="000000" w:space="0" w:sz="8" w:val="single"/>
+          <w:insideH w:color="000000" w:space="0" w:sz="8" w:val="single"/>
+          <w:insideV w:color="000000" w:space="0" w:sz="8" w:val="single"/>
+        </w:tblBorders>
+        <w:tblLayout w:type="fixed"/>
+        <w:tblLook w:val="0600"/>
+      </w:tblPr>
+      <w:tblGrid>
+        <w:gridCol w:w="2267.716535433071"/>
+        <w:gridCol w:w="6236.220472440946"/>
+        <w:tblGridChange w:id="0">
+          <w:tblGrid>
+            <w:gridCol w:w="2267.716535433071"/>
+            <w:gridCol w:w="6236.220472440946"/>
+          </w:tblGrid>
+        </w:tblGridChange>
+      </w:tblGrid>
+      <w:tr>
+        <w:trPr>
+          <w:cantSplit w:val="1"/>
+          <w:tblHeader w:val="0"/>
+        </w:trPr>
+        <w:tc>
+          <w:tcPr>
+            <w:shd w:fill="cfe2f3" w:val="clear"/>
+            <w:tcMar>
+              <w:top w:w="28.34645669291339" w:type="dxa"/>
+              <w:left w:w="28.34645669291339" w:type="dxa"/>
+              <w:bottom w:w="28.34645669291339" w:type="dxa"/>
+              <w:right w:w="28.34645669291339" w:type="dxa"/>
+            </w:tcMar>
+          </w:tcPr>
+          <w:p>
+            <w:pPr>
+              <w:widowControl w:val="0"/>
+              <w:spacing w:line="240" w:lineRule="auto"/>
+              <w:jc w:val="center"/>
+              <w:rPr>
+                <w:b w:val="1"/>
+                <w:bCs w:val="1"/>
+              </w:rPr>
+            </w:pPr>
+            <w:r>
+              <w:rPr>
+                <w:b w:val="1"/>
+                <w:bCs w:val="1"/>
+                <w:rtl w:val="0"/>
+              </w:rPr>
+              <w:t xml:space="preserve">Fecha: 11-10-2026</w:t>
+            </w:r>
+          </w:p>
+        </w:tc>
+        <w:tc>
+          <w:tcPr>
+            <w:shd w:fill="cfe2f3" w:val="clear"/>
+            <w:tcMar>
+              <w:top w:w="28.34645669291339" w:type="dxa"/>
+              <w:left w:w="28.34645669291339" w:type="dxa"/>
+              <w:bottom w:w="28.34645669291339" w:type="dxa"/>
+              <w:right w:w="28.34645669291339" w:type="dxa"/>
+            </w:tcMar>
+          </w:tcPr>
+          <w:p>
+            <w:pPr>
+              <w:widowControl w:val="0"/>
+              <w:spacing w:line="240" w:lineRule="auto"/>
+              <w:rPr>
+                <w:b w:val="1"/>
+                <w:bCs w:val="1"/>
+              </w:rPr>
+            </w:pPr>
+            <w:r>
+              <w:rPr>
+                <w:b w:val="1"/>
+                <w:bCs w:val="1"/>
+                <w:rtl w:val="0"/>
+              </w:rPr>
+              <w:t xml:space="preserve">Sprint: 2</w:t>
+            </w:r>
+          </w:p>
+        </w:tc>
+      </w:tr>
+      <w:tr>
+        <w:trPr>
+          <w:cantSplit w:val="1"/>
+          <w:tblHeader w:val="0"/>
+        </w:trPr>
+        <w:tc>
+          <w:tcPr>
+            <w:tcMar>
+              <w:top w:w="28.34645669291339" w:type="dxa"/>
+              <w:left w:w="28.34645669291339" w:type="dxa"/>
+              <w:bottom w:w="28.34645669291339" w:type="dxa"/>
+              <w:right w:w="28.34645669291339" w:type="dxa"/>
+            </w:tcMar>
+          </w:tcPr>
+          <w:p>
+            <w:pPr>
+              <w:widowControl w:val="0"/>
+              <w:spacing w:line="240" w:lineRule="auto"/>
+              <w:rPr>
+                <w:b w:val="1"/>
+                <w:bCs w:val="1"/>
+              </w:rPr>
+            </w:pPr>
+            <w:r>
+              <w:rPr>
+                <w:b w:val="1"/>
+                <w:bCs w:val="1"/>
+                <w:rtl w:val="0"/>
+              </w:rPr>
+              <w:t xml:space="preserve">Que se hizo</w:t>
+            </w:r>
+          </w:p>
+        </w:tc>
+        <w:tc>
+          <w:tcPr>
+            <w:tcMar>
+              <w:top w:w="28.34645669291339" w:type="dxa"/>
+              <w:left w:w="28.34645669291339" w:type="dxa"/>
+              <w:bottom w:w="28.34645669291339" w:type="dxa"/>
+              <w:right w:w="28.34645669291339" w:type="dxa"/>
+            </w:tcMar>
+          </w:tcPr>
+          <w:p>
+            <w:pPr>
+              <w:widowControl w:val="0"/>
+              <w:spacing w:line="240" w:lineRule="auto"/>
+              <w:rPr/>
+            </w:pPr>
+            <w:r>
+              <w:rPr>
+                <w:rtl w:val="0"/>
+              </w:rPr>
+              <w:t xml:space="preserve">Migración ubicación carpeta proyecto, Implementación otro tipo de servicios, modificaciones tipografía</w:t>
+            </w:r>
+          </w:p>
+        </w:tc>
+      </w:tr>
+      <w:tr>
+        <w:trPr>
+          <w:cantSplit w:val="1"/>
+          <w:tblHeader w:val="0"/>
+        </w:trPr>
+        <w:tc>
+          <w:tcPr>
+            <w:tcMar>
+              <w:top w:w="28.34645669291339" w:type="dxa"/>
+              <w:left w:w="28.34645669291339" w:type="dxa"/>
+              <w:bottom w:w="28.34645669291339" w:type="dxa"/>
+              <w:right w:w="28.34645669291339" w:type="dxa"/>
+            </w:tcMar>
+          </w:tcPr>
+          <w:p>
+            <w:pPr>
+              <w:widowControl w:val="0"/>
+              <w:spacing w:line="240" w:lineRule="auto"/>
+              <w:rPr>
+                <w:b w:val="1"/>
+                <w:bCs w:val="1"/>
+              </w:rPr>
+            </w:pPr>
+            <w:r>
+              <w:rPr>
+                <w:b w:val="1"/>
+                <w:bCs w:val="1"/>
+                <w:rtl w:val="0"/>
+              </w:rPr>
+              <w:t xml:space="preserve">Que se hará</w:t>
+            </w:r>
+          </w:p>
+        </w:tc>
+        <w:tc>
+          <w:tcPr>
+            <w:tcMar>
+              <w:top w:w="28.34645669291339" w:type="dxa"/>
+              <w:left w:w="28.34645669291339" w:type="dxa"/>
+              <w:bottom w:w="28.34645669291339" w:type="dxa"/>
+              <w:right w:w="28.34645669291339" w:type="dxa"/>
+            </w:tcMar>
+          </w:tcPr>
+          <w:p>
+            <w:pPr>
+              <w:widowControl w:val="0"/>
+              <w:spacing w:line="240" w:lineRule="auto"/>
+              <w:rPr/>
+            </w:pPr>
+            <w:r>
+              <w:rPr>
+                <w:rtl w:val="0"/>
+              </w:rPr>
+              <w:t xml:space="preserve">Implementación egistro pedidos (otros servicios)</w:t>
+            </w:r>
+          </w:p>
+        </w:tc>
+      </w:tr>
+      <w:tr>
+        <w:trPr>
+          <w:cantSplit w:val="1"/>
+          <w:tblHeader w:val="0"/>
+        </w:trPr>
+        <w:tc>
+          <w:tcPr>
+            <w:tcMar>
+              <w:top w:w="28.34645669291339" w:type="dxa"/>
+              <w:left w:w="28.34645669291339" w:type="dxa"/>
+              <w:bottom w:w="28.34645669291339" w:type="dxa"/>
+              <w:right w:w="28.34645669291339" w:type="dxa"/>
+            </w:tcMar>
+          </w:tcPr>
+          <w:p>
+            <w:pPr>
+              <w:widowControl w:val="0"/>
+              <w:spacing w:line="240" w:lineRule="auto"/>
+              <w:rPr>
+                <w:b w:val="1"/>
+                <w:bCs w:val="1"/>
+              </w:rPr>
+            </w:pPr>
+            <w:r>
+              <w:rPr>
+                <w:b w:val="1"/>
+                <w:bCs w:val="1"/>
+                <w:rtl w:val="0"/>
+              </w:rPr>
+              <w:t xml:space="preserve">Impedimentos</w:t>
+            </w:r>
+          </w:p>
+        </w:tc>
+        <w:tc>
+          <w:tcPr>
+            <w:tcMar>
+              <w:top w:w="28.34645669291339" w:type="dxa"/>
+              <w:left w:w="28.34645669291339" w:type="dxa"/>
+              <w:bottom w:w="28.34645669291339" w:type="dxa"/>
+              <w:right w:w="28.34645669291339" w:type="dxa"/>
+            </w:tcMar>
+          </w:tcPr>
+          <w:p>
+            <w:pPr>
+              <w:widowControl w:val="0"/>
+              <w:spacing w:line="240" w:lineRule="auto"/>
+              <w:rPr/>
+            </w:pPr>
+            <w:r>
+              <w:rPr>
+                <w:rtl w:val="0"/>
+              </w:rPr>
+              <w:t xml:space="preserve">No Aplica</w:t>
+            </w:r>
+          </w:p>
+        </w:tc>
+      </w:tr>
+    </w:tbl>
+    <w:p>
+      <w:pPr>
+        <w:rPr/>
+      </w:pPr>
+      <w:r>
+        <w:rPr>
+          <w:rtl w:val="0"/>
+        </w:rPr>
+      </w:r>
+    </w:p>
+    <w:tbl>
+      <w:tblPr>
+        <w:tblStyle w:val="Table35"/>
+        <w:tblW w:w="8503.937007874018" w:type="dxa"/>
+        <w:jc w:val="center"/>
+        <w:tblBorders>
+          <w:top w:color="000000" w:space="0" w:sz="8" w:val="single"/>
+          <w:left w:color="000000" w:space="0" w:sz="8" w:val="single"/>
+          <w:bottom w:color="000000" w:space="0" w:sz="8" w:val="single"/>
+          <w:right w:color="000000" w:space="0" w:sz="8" w:val="single"/>
+          <w:insideH w:color="000000" w:space="0" w:sz="8" w:val="single"/>
+          <w:insideV w:color="000000" w:space="0" w:sz="8" w:val="single"/>
+        </w:tblBorders>
+        <w:tblLayout w:type="fixed"/>
+        <w:tblLook w:val="0600"/>
+      </w:tblPr>
+      <w:tblGrid>
+        <w:gridCol w:w="2267.716535433071"/>
+        <w:gridCol w:w="6236.220472440946"/>
+        <w:tblGridChange w:id="0">
+          <w:tblGrid>
+            <w:gridCol w:w="2267.716535433071"/>
+            <w:gridCol w:w="6236.220472440946"/>
+          </w:tblGrid>
+        </w:tblGridChange>
+      </w:tblGrid>
+      <w:tr>
+        <w:trPr>
+          <w:cantSplit w:val="1"/>
+          <w:tblHeader w:val="0"/>
+        </w:trPr>
+        <w:tc>
+          <w:tcPr>
+            <w:shd w:fill="cfe2f3" w:val="clear"/>
+            <w:tcMar>
+              <w:top w:w="28.34645669291339" w:type="dxa"/>
+              <w:left w:w="28.34645669291339" w:type="dxa"/>
+              <w:bottom w:w="28.34645669291339" w:type="dxa"/>
+              <w:right w:w="28.34645669291339" w:type="dxa"/>
+            </w:tcMar>
+          </w:tcPr>
+          <w:p>
+            <w:pPr>
+              <w:widowControl w:val="0"/>
+              <w:spacing w:line="240" w:lineRule="auto"/>
+              <w:jc w:val="center"/>
+              <w:rPr>
+                <w:b w:val="1"/>
+                <w:bCs w:val="1"/>
+              </w:rPr>
+            </w:pPr>
+            <w:r>
+              <w:rPr>
+                <w:b w:val="1"/>
+                <w:bCs w:val="1"/>
+                <w:rtl w:val="0"/>
+              </w:rPr>
+              <w:t xml:space="preserve">Fecha: 12-10-2026</w:t>
+            </w:r>
+          </w:p>
+        </w:tc>
+        <w:tc>
+          <w:tcPr>
+            <w:shd w:fill="cfe2f3" w:val="clear"/>
+            <w:tcMar>
+              <w:top w:w="28.34645669291339" w:type="dxa"/>
+              <w:left w:w="28.34645669291339" w:type="dxa"/>
+              <w:bottom w:w="28.34645669291339" w:type="dxa"/>
+              <w:right w:w="28.34645669291339" w:type="dxa"/>
+            </w:tcMar>
+          </w:tcPr>
+          <w:p>
+            <w:pPr>
+              <w:widowControl w:val="0"/>
+              <w:spacing w:line="240" w:lineRule="auto"/>
+              <w:rPr>
+                <w:b w:val="1"/>
+                <w:bCs w:val="1"/>
+              </w:rPr>
+            </w:pPr>
+            <w:r>
+              <w:rPr>
+                <w:b w:val="1"/>
+                <w:bCs w:val="1"/>
+                <w:rtl w:val="0"/>
+              </w:rPr>
+              <w:t xml:space="preserve">Sprint: 2</w:t>
+            </w:r>
+          </w:p>
+        </w:tc>
+      </w:tr>
+      <w:tr>
+        <w:trPr>
+          <w:cantSplit w:val="1"/>
+          <w:tblHeader w:val="0"/>
+        </w:trPr>
+        <w:tc>
+          <w:tcPr>
+            <w:tcMar>
+              <w:top w:w="28.34645669291339" w:type="dxa"/>
+              <w:left w:w="28.34645669291339" w:type="dxa"/>
+              <w:bottom w:w="28.34645669291339" w:type="dxa"/>
+              <w:right w:w="28.34645669291339" w:type="dxa"/>
+            </w:tcMar>
+          </w:tcPr>
+          <w:p>
+            <w:pPr>
+              <w:widowControl w:val="0"/>
+              <w:spacing w:line="240" w:lineRule="auto"/>
+              <w:rPr>
+                <w:b w:val="1"/>
+                <w:bCs w:val="1"/>
+              </w:rPr>
+            </w:pPr>
+            <w:r>
+              <w:rPr>
+                <w:b w:val="1"/>
+                <w:bCs w:val="1"/>
+                <w:rtl w:val="0"/>
+              </w:rPr>
+              <w:t xml:space="preserve">Que se hizo</w:t>
+            </w:r>
+          </w:p>
+        </w:tc>
+        <w:tc>
+          <w:tcPr>
+            <w:tcMar>
+              <w:top w:w="28.34645669291339" w:type="dxa"/>
+              <w:left w:w="28.34645669291339" w:type="dxa"/>
+              <w:bottom w:w="28.34645669291339" w:type="dxa"/>
+              <w:right w:w="28.34645669291339" w:type="dxa"/>
+            </w:tcMar>
+          </w:tcPr>
+          <w:p>
+            <w:pPr>
+              <w:widowControl w:val="0"/>
+              <w:spacing w:line="240" w:lineRule="auto"/>
+              <w:rPr/>
+            </w:pPr>
+            <w:r>
+              <w:rPr>
+                <w:rtl w:val="0"/>
+              </w:rPr>
+              <w:t xml:space="preserve">Implementación egistro pedidos (otros servicios)</w:t>
+            </w:r>
+          </w:p>
+        </w:tc>
+      </w:tr>
+      <w:tr>
+        <w:trPr>
+          <w:cantSplit w:val="1"/>
+          <w:tblHeader w:val="0"/>
+        </w:trPr>
+        <w:tc>
+          <w:tcPr>
+            <w:tcMar>
+              <w:top w:w="28.34645669291339" w:type="dxa"/>
+              <w:left w:w="28.34645669291339" w:type="dxa"/>
+              <w:bottom w:w="28.34645669291339" w:type="dxa"/>
+              <w:right w:w="28.34645669291339" w:type="dxa"/>
+            </w:tcMar>
+          </w:tcPr>
+          <w:p>
+            <w:pPr>
+              <w:widowControl w:val="0"/>
+              <w:spacing w:line="240" w:lineRule="auto"/>
+              <w:rPr>
+                <w:b w:val="1"/>
+                <w:bCs w:val="1"/>
+              </w:rPr>
+            </w:pPr>
+            <w:r>
+              <w:rPr>
+                <w:b w:val="1"/>
+                <w:bCs w:val="1"/>
+                <w:rtl w:val="0"/>
+              </w:rPr>
+              <w:t xml:space="preserve">Que se hará</w:t>
+            </w:r>
+          </w:p>
+        </w:tc>
+        <w:tc>
+          <w:tcPr>
+            <w:tcMar>
+              <w:top w:w="28.34645669291339" w:type="dxa"/>
+              <w:left w:w="28.34645669291339" w:type="dxa"/>
+              <w:bottom w:w="28.34645669291339" w:type="dxa"/>
+              <w:right w:w="28.34645669291339" w:type="dxa"/>
+            </w:tcMar>
+          </w:tcPr>
+          <w:p>
+            <w:pPr>
+              <w:widowControl w:val="0"/>
+              <w:spacing w:line="240" w:lineRule="auto"/>
+              <w:rPr/>
+            </w:pPr>
+            <w:r>
+              <w:rPr>
+                <w:rtl w:val="0"/>
+              </w:rPr>
+              <w:t xml:space="preserve">No Aplica</w:t>
+            </w:r>
+          </w:p>
+        </w:tc>
+      </w:tr>
+      <w:tr>
+        <w:trPr>
+          <w:cantSplit w:val="1"/>
+          <w:tblHeader w:val="0"/>
+        </w:trPr>
+        <w:tc>
+          <w:tcPr>
+            <w:tcMar>
+              <w:top w:w="28.34645669291339" w:type="dxa"/>
+              <w:left w:w="28.34645669291339" w:type="dxa"/>
+              <w:bottom w:w="28.34645669291339" w:type="dxa"/>
+              <w:right w:w="28.34645669291339" w:type="dxa"/>
+            </w:tcMar>
+          </w:tcPr>
+          <w:p>
+            <w:pPr>
+              <w:widowControl w:val="0"/>
+              <w:spacing w:line="240" w:lineRule="auto"/>
+              <w:rPr>
+                <w:b w:val="1"/>
+                <w:bCs w:val="1"/>
+              </w:rPr>
+            </w:pPr>
+            <w:r>
+              <w:rPr>
+                <w:b w:val="1"/>
+                <w:bCs w:val="1"/>
+                <w:rtl w:val="0"/>
+              </w:rPr>
+              <w:t xml:space="preserve">Impedimentos</w:t>
+            </w:r>
+          </w:p>
+        </w:tc>
+        <w:tc>
+          <w:tcPr>
+            <w:tcMar>
+              <w:top w:w="28.34645669291339" w:type="dxa"/>
+              <w:left w:w="28.34645669291339" w:type="dxa"/>
+              <w:bottom w:w="28.34645669291339" w:type="dxa"/>
+              <w:right w:w="28.34645669291339" w:type="dxa"/>
+            </w:tcMar>
+          </w:tcPr>
+          <w:p>
+            <w:pPr>
+              <w:widowControl w:val="0"/>
+              <w:spacing w:line="240" w:lineRule="auto"/>
+              <w:rPr/>
+            </w:pPr>
+            <w:r>
+              <w:rPr>
+                <w:rtl w:val="0"/>
+              </w:rPr>
+              <w:t xml:space="preserve">No Aplica</w:t>
+            </w:r>
+          </w:p>
+        </w:tc>
+      </w:tr>
+    </w:tbl>
+    <w:p>
+      <w:pPr>
+        <w:rPr/>
+      </w:pPr>
+      <w:r>
+        <w:br w:type="page"/>
+      </w:r>
+      <w:r>
+        <w:rPr>
+          <w:rtl w:val="0"/>
+        </w:rPr>
+      </w:r>
+    </w:p>
+    <w:p>
+      <w:pPr>
+        <w:rPr/>
+      </w:pPr>
+      <w:r>
+        <w:rPr>
+          <w:rtl w:val="0"/>
+        </w:rPr>
+      </w:r>
+    </w:p>
+    <w:tbl>
+      <w:tblPr>
+        <w:tblStyle w:val="Table36"/>
+        <w:tblW w:w="8503.937007874018" w:type="dxa"/>
+        <w:jc w:val="center"/>
+        <w:tblBorders>
+          <w:top w:color="000000" w:space="0" w:sz="8" w:val="single"/>
+          <w:left w:color="000000" w:space="0" w:sz="8" w:val="single"/>
+          <w:bottom w:color="000000" w:space="0" w:sz="8" w:val="single"/>
+          <w:right w:color="000000" w:space="0" w:sz="8" w:val="single"/>
+          <w:insideH w:color="000000" w:space="0" w:sz="8" w:val="single"/>
+          <w:insideV w:color="000000" w:space="0" w:sz="8" w:val="single"/>
+        </w:tblBorders>
+        <w:tblLayout w:type="fixed"/>
+        <w:tblLook w:val="0600"/>
+      </w:tblPr>
+      <w:tblGrid>
+        <w:gridCol w:w="2267.716535433071"/>
+        <w:gridCol w:w="6236.220472440946"/>
+        <w:tblGridChange w:id="0">
+          <w:tblGrid>
+            <w:gridCol w:w="2267.716535433071"/>
+            <w:gridCol w:w="6236.220472440946"/>
+          </w:tblGrid>
+        </w:tblGridChange>
+      </w:tblGrid>
+      <w:tr>
+        <w:trPr>
+          <w:cantSplit w:val="1"/>
+          <w:tblHeader w:val="0"/>
+        </w:trPr>
+        <w:tc>
+          <w:tcPr>
+            <w:shd w:fill="cfe2f3" w:val="clear"/>
+            <w:tcMar>
+              <w:top w:w="28.34645669291339" w:type="dxa"/>
+              <w:left w:w="28.34645669291339" w:type="dxa"/>
+              <w:bottom w:w="28.34645669291339" w:type="dxa"/>
+              <w:right w:w="28.34645669291339" w:type="dxa"/>
+            </w:tcMar>
+          </w:tcPr>
+          <w:p>
+            <w:pPr>
+              <w:widowControl w:val="0"/>
+              <w:spacing w:line="240" w:lineRule="auto"/>
+              <w:jc w:val="center"/>
+              <w:rPr>
+                <w:b w:val="1"/>
+                <w:bCs w:val="1"/>
+              </w:rPr>
+            </w:pPr>
+            <w:r>
+              <w:rPr>
+                <w:b w:val="1"/>
+                <w:bCs w:val="1"/>
+                <w:rtl w:val="0"/>
+              </w:rPr>
+              <w:t xml:space="preserve">Fecha: 13-10-2026</w:t>
+            </w:r>
+          </w:p>
+        </w:tc>
+        <w:tc>
+          <w:tcPr>
+            <w:shd w:fill="cfe2f3" w:val="clear"/>
+            <w:tcMar>
+              <w:top w:w="28.34645669291339" w:type="dxa"/>
+              <w:left w:w="28.34645669291339" w:type="dxa"/>
+              <w:bottom w:w="28.34645669291339" w:type="dxa"/>
+              <w:right w:w="28.34645669291339" w:type="dxa"/>
+            </w:tcMar>
+          </w:tcPr>
+          <w:p>
+            <w:pPr>
+              <w:widowControl w:val="0"/>
+              <w:spacing w:line="240" w:lineRule="auto"/>
+              <w:rPr>
+                <w:b w:val="1"/>
+                <w:bCs w:val="1"/>
+              </w:rPr>
+            </w:pPr>
+            <w:r>
+              <w:rPr>
+                <w:b w:val="1"/>
+                <w:bCs w:val="1"/>
+                <w:rtl w:val="0"/>
+              </w:rPr>
+              <w:t xml:space="preserve">Sprint: 2</w:t>
+            </w:r>
+          </w:p>
+        </w:tc>
+      </w:tr>
+      <w:tr>
+        <w:trPr>
+          <w:cantSplit w:val="1"/>
+          <w:tblHeader w:val="0"/>
+        </w:trPr>
+        <w:tc>
+          <w:tcPr>
+            <w:tcMar>
+              <w:top w:w="28.34645669291339" w:type="dxa"/>
+              <w:left w:w="28.34645669291339" w:type="dxa"/>
+              <w:bottom w:w="28.34645669291339" w:type="dxa"/>
+              <w:right w:w="28.34645669291339" w:type="dxa"/>
+            </w:tcMar>
+          </w:tcPr>
+          <w:p>
+            <w:pPr>
+              <w:widowControl w:val="0"/>
+              <w:spacing w:line="240" w:lineRule="auto"/>
+              <w:rPr>
+                <w:b w:val="1"/>
+                <w:bCs w:val="1"/>
+              </w:rPr>
+            </w:pPr>
+            <w:r>
+              <w:rPr>
+                <w:b w:val="1"/>
+                <w:bCs w:val="1"/>
+                <w:rtl w:val="0"/>
+              </w:rPr>
+              <w:t xml:space="preserve">Que se hizo</w:t>
+            </w:r>
+          </w:p>
+        </w:tc>
+        <w:tc>
+          <w:tcPr>
+            <w:tcMar>
+              <w:top w:w="28.34645669291339" w:type="dxa"/>
+              <w:left w:w="28.34645669291339" w:type="dxa"/>
+              <w:bottom w:w="28.34645669291339" w:type="dxa"/>
+              <w:right w:w="28.34645669291339" w:type="dxa"/>
+            </w:tcMar>
+          </w:tcPr>
+          <w:p>
+            <w:pPr>
+              <w:widowControl w:val="0"/>
+              <w:spacing w:line="240" w:lineRule="auto"/>
+              <w:rPr/>
+            </w:pPr>
+            <w:r>
+              <w:rPr>
+                <w:rtl w:val="0"/>
+              </w:rPr>
+              <w:t xml:space="preserve">No Aplica</w:t>
+            </w:r>
+          </w:p>
+        </w:tc>
+      </w:tr>
+      <w:tr>
+        <w:trPr>
+          <w:cantSplit w:val="1"/>
+          <w:tblHeader w:val="0"/>
+        </w:trPr>
+        <w:tc>
+          <w:tcPr>
+            <w:tcMar>
+              <w:top w:w="28.34645669291339" w:type="dxa"/>
+              <w:left w:w="28.34645669291339" w:type="dxa"/>
+              <w:bottom w:w="28.34645669291339" w:type="dxa"/>
+              <w:right w:w="28.34645669291339" w:type="dxa"/>
+            </w:tcMar>
+          </w:tcPr>
+          <w:p>
+            <w:pPr>
+              <w:widowControl w:val="0"/>
+              <w:spacing w:line="240" w:lineRule="auto"/>
+              <w:rPr>
+                <w:b w:val="1"/>
+                <w:bCs w:val="1"/>
+              </w:rPr>
+            </w:pPr>
+            <w:r>
+              <w:rPr>
+                <w:b w:val="1"/>
+                <w:bCs w:val="1"/>
+                <w:rtl w:val="0"/>
+              </w:rPr>
+              <w:t xml:space="preserve">Que se hará</w:t>
+            </w:r>
+          </w:p>
+        </w:tc>
+        <w:tc>
+          <w:tcPr>
+            <w:tcMar>
+              <w:top w:w="28.34645669291339" w:type="dxa"/>
+              <w:left w:w="28.34645669291339" w:type="dxa"/>
+              <w:bottom w:w="28.34645669291339" w:type="dxa"/>
+              <w:right w:w="28.34645669291339" w:type="dxa"/>
+            </w:tcMar>
+          </w:tcPr>
+          <w:p>
+            <w:pPr>
+              <w:widowControl w:val="0"/>
+              <w:spacing w:line="240" w:lineRule="auto"/>
+              <w:rPr/>
+            </w:pPr>
+            <w:r>
+              <w:rPr>
+                <w:rtl w:val="0"/>
+              </w:rPr>
+              <w:t xml:space="preserve">Avances documentos presentación</w:t>
+            </w:r>
+          </w:p>
+        </w:tc>
+      </w:tr>
+      <w:tr>
+        <w:trPr>
+          <w:cantSplit w:val="1"/>
+          <w:tblHeader w:val="0"/>
+        </w:trPr>
+        <w:tc>
+          <w:tcPr>
+            <w:tcMar>
+              <w:top w:w="28.34645669291339" w:type="dxa"/>
+              <w:left w:w="28.34645669291339" w:type="dxa"/>
+              <w:bottom w:w="28.34645669291339" w:type="dxa"/>
+              <w:right w:w="28.34645669291339" w:type="dxa"/>
+            </w:tcMar>
+          </w:tcPr>
+          <w:p>
+            <w:pPr>
+              <w:widowControl w:val="0"/>
+              <w:spacing w:line="240" w:lineRule="auto"/>
+              <w:rPr>
+                <w:b w:val="1"/>
+                <w:bCs w:val="1"/>
+              </w:rPr>
+            </w:pPr>
+            <w:r>
+              <w:rPr>
+                <w:b w:val="1"/>
+                <w:bCs w:val="1"/>
+                <w:rtl w:val="0"/>
+              </w:rPr>
+              <w:t xml:space="preserve">Impedimentos</w:t>
+            </w:r>
+          </w:p>
+        </w:tc>
+        <w:tc>
+          <w:tcPr>
+            <w:tcMar>
+              <w:top w:w="28.34645669291339" w:type="dxa"/>
+              <w:left w:w="28.34645669291339" w:type="dxa"/>
+              <w:bottom w:w="28.34645669291339" w:type="dxa"/>
+              <w:right w:w="28.34645669291339" w:type="dxa"/>
+            </w:tcMar>
+          </w:tcPr>
+          <w:p>
+            <w:pPr>
+              <w:widowControl w:val="0"/>
+              <w:spacing w:line="240" w:lineRule="auto"/>
+              <w:rPr/>
+            </w:pPr>
+            <w:r>
+              <w:rPr>
+                <w:rtl w:val="0"/>
+              </w:rPr>
+              <w:t xml:space="preserve">No Aplica</w:t>
+            </w:r>
+          </w:p>
+        </w:tc>
+      </w:tr>
+    </w:tbl>
+    <w:p>
+      <w:pPr>
+        <w:rPr/>
+      </w:pPr>
+      <w:r>
+        <w:rPr>
+          <w:rtl w:val="0"/>
+        </w:rPr>
+      </w:r>
+    </w:p>
+    <w:tbl>
+      <w:tblPr>
+        <w:tblStyle w:val="Table37"/>
+        <w:tblW w:w="8503.937007874018" w:type="dxa"/>
+        <w:jc w:val="center"/>
+        <w:tblBorders>
+          <w:top w:color="000000" w:space="0" w:sz="8" w:val="single"/>
+          <w:left w:color="000000" w:space="0" w:sz="8" w:val="single"/>
+          <w:bottom w:color="000000" w:space="0" w:sz="8" w:val="single"/>
+          <w:right w:color="000000" w:space="0" w:sz="8" w:val="single"/>
+          <w:insideH w:color="000000" w:space="0" w:sz="8" w:val="single"/>
+          <w:insideV w:color="000000" w:space="0" w:sz="8" w:val="single"/>
+        </w:tblBorders>
+        <w:tblLayout w:type="fixed"/>
+        <w:tblLook w:val="0600"/>
+      </w:tblPr>
+      <w:tblGrid>
+        <w:gridCol w:w="2267.716535433071"/>
+        <w:gridCol w:w="6236.220472440946"/>
+        <w:tblGridChange w:id="0">
+          <w:tblGrid>
+            <w:gridCol w:w="2267.716535433071"/>
+            <w:gridCol w:w="6236.220472440946"/>
+          </w:tblGrid>
+        </w:tblGridChange>
+      </w:tblGrid>
+      <w:tr>
+        <w:trPr>
+          <w:cantSplit w:val="1"/>
+          <w:tblHeader w:val="0"/>
+        </w:trPr>
+        <w:tc>
+          <w:tcPr>
+            <w:shd w:fill="cfe2f3" w:val="clear"/>
+            <w:tcMar>
+              <w:top w:w="28.34645669291339" w:type="dxa"/>
+              <w:left w:w="28.34645669291339" w:type="dxa"/>
+              <w:bottom w:w="28.34645669291339" w:type="dxa"/>
+              <w:right w:w="28.34645669291339" w:type="dxa"/>
+            </w:tcMar>
+          </w:tcPr>
+          <w:p>
+            <w:pPr>
+              <w:widowControl w:val="0"/>
+              <w:spacing w:line="240" w:lineRule="auto"/>
+              <w:jc w:val="center"/>
+              <w:rPr>
+                <w:b w:val="1"/>
+                <w:bCs w:val="1"/>
+              </w:rPr>
+            </w:pPr>
+            <w:r>
+              <w:rPr>
+                <w:b w:val="1"/>
+                <w:bCs w:val="1"/>
+                <w:rtl w:val="0"/>
+              </w:rPr>
+              <w:t xml:space="preserve">Fecha: 14-10-2026</w:t>
+            </w:r>
+          </w:p>
+        </w:tc>
+        <w:tc>
+          <w:tcPr>
+            <w:shd w:fill="cfe2f3" w:val="clear"/>
+            <w:tcMar>
+              <w:top w:w="28.34645669291339" w:type="dxa"/>
+              <w:left w:w="28.34645669291339" w:type="dxa"/>
+              <w:bottom w:w="28.34645669291339" w:type="dxa"/>
+              <w:right w:w="28.34645669291339" w:type="dxa"/>
+            </w:tcMar>
+          </w:tcPr>
+          <w:p>
+            <w:pPr>
+              <w:widowControl w:val="0"/>
+              <w:spacing w:line="240" w:lineRule="auto"/>
+              <w:rPr>
+                <w:b w:val="1"/>
+                <w:bCs w:val="1"/>
+              </w:rPr>
+            </w:pPr>
+            <w:r>
+              <w:rPr>
+                <w:b w:val="1"/>
+                <w:bCs w:val="1"/>
+                <w:rtl w:val="0"/>
+              </w:rPr>
+              <w:t xml:space="preserve">Sprint: 2</w:t>
+            </w:r>
+          </w:p>
+        </w:tc>
+      </w:tr>
+      <w:tr>
+        <w:trPr>
+          <w:cantSplit w:val="1"/>
+          <w:tblHeader w:val="0"/>
+        </w:trPr>
+        <w:tc>
+          <w:tcPr>
+            <w:tcMar>
+              <w:top w:w="28.34645669291339" w:type="dxa"/>
+              <w:left w:w="28.34645669291339" w:type="dxa"/>
+              <w:bottom w:w="28.34645669291339" w:type="dxa"/>
+              <w:right w:w="28.34645669291339" w:type="dxa"/>
+            </w:tcMar>
+          </w:tcPr>
+          <w:p>
+            <w:pPr>
+              <w:widowControl w:val="0"/>
+              <w:spacing w:line="240" w:lineRule="auto"/>
+              <w:rPr>
+                <w:b w:val="1"/>
+                <w:bCs w:val="1"/>
+              </w:rPr>
+            </w:pPr>
+            <w:r>
+              <w:rPr>
+                <w:b w:val="1"/>
+                <w:bCs w:val="1"/>
+                <w:rtl w:val="0"/>
+              </w:rPr>
+              <w:t xml:space="preserve">Que se hizo</w:t>
+            </w:r>
+          </w:p>
+        </w:tc>
+        <w:tc>
+          <w:tcPr>
+            <w:tcMar>
+              <w:top w:w="28.34645669291339" w:type="dxa"/>
+              <w:left w:w="28.34645669291339" w:type="dxa"/>
+              <w:bottom w:w="28.34645669291339" w:type="dxa"/>
+              <w:right w:w="28.34645669291339" w:type="dxa"/>
+            </w:tcMar>
+          </w:tcPr>
+          <w:p>
+            <w:pPr>
+              <w:widowControl w:val="0"/>
+              <w:spacing w:line="240" w:lineRule="auto"/>
+              <w:rPr/>
+            </w:pPr>
+            <w:r>
+              <w:rPr>
+                <w:rtl w:val="0"/>
+              </w:rPr>
+              <w:t xml:space="preserve">Avances documentos presentación</w:t>
+            </w:r>
+          </w:p>
+        </w:tc>
+      </w:tr>
+      <w:tr>
+        <w:trPr>
+          <w:cantSplit w:val="1"/>
+          <w:tblHeader w:val="0"/>
+        </w:trPr>
+        <w:tc>
+          <w:tcPr>
+            <w:tcMar>
+              <w:top w:w="28.34645669291339" w:type="dxa"/>
+              <w:left w:w="28.34645669291339" w:type="dxa"/>
+              <w:bottom w:w="28.34645669291339" w:type="dxa"/>
+              <w:right w:w="28.34645669291339" w:type="dxa"/>
+            </w:tcMar>
+          </w:tcPr>
+          <w:p>
+            <w:pPr>
+              <w:widowControl w:val="0"/>
+              <w:spacing w:line="240" w:lineRule="auto"/>
+              <w:rPr>
+                <w:b w:val="1"/>
+                <w:bCs w:val="1"/>
+              </w:rPr>
+            </w:pPr>
+            <w:r>
+              <w:rPr>
+                <w:b w:val="1"/>
+                <w:bCs w:val="1"/>
+                <w:rtl w:val="0"/>
+              </w:rPr>
+              <w:t xml:space="preserve">Que se hará</w:t>
+            </w:r>
+          </w:p>
+        </w:tc>
+        <w:tc>
+          <w:tcPr>
+            <w:tcMar>
+              <w:top w:w="28.34645669291339" w:type="dxa"/>
+              <w:left w:w="28.34645669291339" w:type="dxa"/>
+              <w:bottom w:w="28.34645669291339" w:type="dxa"/>
+              <w:right w:w="28.34645669291339" w:type="dxa"/>
+            </w:tcMar>
+          </w:tcPr>
+          <w:p>
+            <w:pPr>
+              <w:widowControl w:val="0"/>
+              <w:spacing w:line="240" w:lineRule="auto"/>
+              <w:rPr/>
+            </w:pPr>
+            <w:r>
+              <w:rPr>
+                <w:rtl w:val="0"/>
+              </w:rPr>
+              <w:t xml:space="preserve">Finalizar avances documentos presentación</w:t>
+            </w:r>
+          </w:p>
+        </w:tc>
+      </w:tr>
+      <w:tr>
+        <w:trPr>
+          <w:cantSplit w:val="1"/>
+          <w:tblHeader w:val="0"/>
+        </w:trPr>
+        <w:tc>
+          <w:tcPr>
+            <w:tcMar>
+              <w:top w:w="28.34645669291339" w:type="dxa"/>
+              <w:left w:w="28.34645669291339" w:type="dxa"/>
+              <w:bottom w:w="28.34645669291339" w:type="dxa"/>
+              <w:right w:w="28.34645669291339" w:type="dxa"/>
+            </w:tcMar>
+          </w:tcPr>
+          <w:p>
+            <w:pPr>
+              <w:widowControl w:val="0"/>
+              <w:spacing w:line="240" w:lineRule="auto"/>
+              <w:rPr>
+                <w:b w:val="1"/>
+                <w:bCs w:val="1"/>
+              </w:rPr>
+            </w:pPr>
+            <w:r>
+              <w:rPr>
+                <w:b w:val="1"/>
+                <w:bCs w:val="1"/>
+                <w:rtl w:val="0"/>
+              </w:rPr>
+              <w:t xml:space="preserve">Impedimentos</w:t>
+            </w:r>
+          </w:p>
+        </w:tc>
+        <w:tc>
+          <w:tcPr>
+            <w:tcMar>
+              <w:top w:w="28.34645669291339" w:type="dxa"/>
+              <w:left w:w="28.34645669291339" w:type="dxa"/>
+              <w:bottom w:w="28.34645669291339" w:type="dxa"/>
+              <w:right w:w="28.34645669291339" w:type="dxa"/>
+            </w:tcMar>
+          </w:tcPr>
+          <w:p>
+            <w:pPr>
+              <w:widowControl w:val="0"/>
+              <w:spacing w:line="240" w:lineRule="auto"/>
+              <w:rPr/>
+            </w:pPr>
+            <w:r>
+              <w:rPr>
+                <w:rtl w:val="0"/>
+              </w:rPr>
+              <w:t xml:space="preserve">No Aplica</w:t>
+            </w:r>
+          </w:p>
+        </w:tc>
+      </w:tr>
+    </w:tbl>
+    <w:p>
+      <w:pPr>
+        <w:rPr/>
+      </w:pPr>
+      <w:r>
+        <w:rPr>
+          <w:rtl w:val="0"/>
+        </w:rPr>
+      </w:r>
+    </w:p>
+    <w:tbl>
+      <w:tblPr>
+        <w:tblStyle w:val="Table38"/>
+        <w:tblW w:w="8503.937007874018" w:type="dxa"/>
+        <w:jc w:val="center"/>
+        <w:tblBorders>
+          <w:top w:color="000000" w:space="0" w:sz="8" w:val="single"/>
+          <w:left w:color="000000" w:space="0" w:sz="8" w:val="single"/>
+          <w:bottom w:color="000000" w:space="0" w:sz="8" w:val="single"/>
+          <w:right w:color="000000" w:space="0" w:sz="8" w:val="single"/>
+          <w:insideH w:color="000000" w:space="0" w:sz="8" w:val="single"/>
+          <w:insideV w:color="000000" w:space="0" w:sz="8" w:val="single"/>
+        </w:tblBorders>
+        <w:tblLayout w:type="fixed"/>
+        <w:tblLook w:val="0600"/>
+      </w:tblPr>
+      <w:tblGrid>
+        <w:gridCol w:w="2267.716535433071"/>
+        <w:gridCol w:w="6236.220472440946"/>
+        <w:tblGridChange w:id="0">
+          <w:tblGrid>
+            <w:gridCol w:w="2267.716535433071"/>
+            <w:gridCol w:w="6236.220472440946"/>
+          </w:tblGrid>
+        </w:tblGridChange>
+      </w:tblGrid>
+      <w:tr>
+        <w:trPr>
+          <w:cantSplit w:val="1"/>
+          <w:tblHeader w:val="0"/>
+        </w:trPr>
+        <w:tc>
+          <w:tcPr>
+            <w:shd w:fill="cfe2f3" w:val="clear"/>
+            <w:tcMar>
+              <w:top w:w="28.34645669291339" w:type="dxa"/>
+              <w:left w:w="28.34645669291339" w:type="dxa"/>
+              <w:bottom w:w="28.34645669291339" w:type="dxa"/>
+              <w:right w:w="28.34645669291339" w:type="dxa"/>
+            </w:tcMar>
+          </w:tcPr>
+          <w:p>
+            <w:pPr>
+              <w:widowControl w:val="0"/>
+              <w:spacing w:line="240" w:lineRule="auto"/>
+              <w:jc w:val="center"/>
+              <w:rPr>
+                <w:b w:val="1"/>
+                <w:bCs w:val="1"/>
+              </w:rPr>
+            </w:pPr>
+            <w:r>
+              <w:rPr>
+                <w:b w:val="1"/>
+                <w:bCs w:val="1"/>
+                <w:rtl w:val="0"/>
+              </w:rPr>
+              <w:t xml:space="preserve">Fecha: 15-10-2026</w:t>
+            </w:r>
+          </w:p>
+        </w:tc>
+        <w:tc>
+          <w:tcPr>
+            <w:shd w:fill="cfe2f3" w:val="clear"/>
+            <w:tcMar>
+              <w:top w:w="28.34645669291339" w:type="dxa"/>
+              <w:left w:w="28.34645669291339" w:type="dxa"/>
+              <w:bottom w:w="28.34645669291339" w:type="dxa"/>
+              <w:right w:w="28.34645669291339" w:type="dxa"/>
+            </w:tcMar>
+          </w:tcPr>
+          <w:p>
+            <w:pPr>
+              <w:widowControl w:val="0"/>
+              <w:spacing w:line="240" w:lineRule="auto"/>
+              <w:rPr>
+                <w:b w:val="1"/>
+                <w:bCs w:val="1"/>
+              </w:rPr>
+            </w:pPr>
+            <w:r>
+              <w:rPr>
+                <w:b w:val="1"/>
+                <w:bCs w:val="1"/>
+                <w:rtl w:val="0"/>
+              </w:rPr>
+              <w:t xml:space="preserve">Sprint: 2</w:t>
+            </w:r>
+          </w:p>
+        </w:tc>
+      </w:tr>
+      <w:tr>
+        <w:trPr>
+          <w:cantSplit w:val="1"/>
+          <w:tblHeader w:val="0"/>
+        </w:trPr>
+        <w:tc>
+          <w:tcPr>
+            <w:tcMar>
+              <w:top w:w="28.34645669291339" w:type="dxa"/>
+              <w:left w:w="28.34645669291339" w:type="dxa"/>
+              <w:bottom w:w="28.34645669291339" w:type="dxa"/>
+              <w:right w:w="28.34645669291339" w:type="dxa"/>
+            </w:tcMar>
+          </w:tcPr>
+          <w:p>
+            <w:pPr>
+              <w:widowControl w:val="0"/>
+              <w:spacing w:line="240" w:lineRule="auto"/>
+              <w:rPr>
+                <w:b w:val="1"/>
+                <w:bCs w:val="1"/>
+              </w:rPr>
+            </w:pPr>
+            <w:r>
+              <w:rPr>
+                <w:b w:val="1"/>
+                <w:bCs w:val="1"/>
+                <w:rtl w:val="0"/>
+              </w:rPr>
+              <w:t xml:space="preserve">Que se hizo</w:t>
+            </w:r>
+          </w:p>
+        </w:tc>
+        <w:tc>
+          <w:tcPr>
+            <w:tcMar>
+              <w:top w:w="28.34645669291339" w:type="dxa"/>
+              <w:left w:w="28.34645669291339" w:type="dxa"/>
+              <w:bottom w:w="28.34645669291339" w:type="dxa"/>
+              <w:right w:w="28.34645669291339" w:type="dxa"/>
+            </w:tcMar>
+          </w:tcPr>
+          <w:p>
+            <w:pPr>
+              <w:widowControl w:val="0"/>
+              <w:spacing w:line="240" w:lineRule="auto"/>
+              <w:rPr/>
+            </w:pPr>
+            <w:r>
+              <w:rPr>
+                <w:rtl w:val="0"/>
+              </w:rPr>
+            </w:r>
+          </w:p>
+        </w:tc>
+      </w:tr>
+      <w:tr>
+        <w:trPr>
+          <w:cantSplit w:val="1"/>
+          <w:tblHeader w:val="0"/>
+        </w:trPr>
+        <w:tc>
+          <w:tcPr>
+            <w:tcMar>
+              <w:top w:w="28.34645669291339" w:type="dxa"/>
+              <w:left w:w="28.34645669291339" w:type="dxa"/>
+              <w:bottom w:w="28.34645669291339" w:type="dxa"/>
+              <w:right w:w="28.34645669291339" w:type="dxa"/>
+            </w:tcMar>
+          </w:tcPr>
+          <w:p>
+            <w:pPr>
+              <w:widowControl w:val="0"/>
+              <w:spacing w:line="240" w:lineRule="auto"/>
+              <w:rPr>
+                <w:b w:val="1"/>
+                <w:bCs w:val="1"/>
+              </w:rPr>
+            </w:pPr>
+            <w:r>
+              <w:rPr>
+                <w:b w:val="1"/>
+                <w:bCs w:val="1"/>
+                <w:rtl w:val="0"/>
+              </w:rPr>
+              <w:t xml:space="preserve">Que se hará</w:t>
+            </w:r>
+          </w:p>
+        </w:tc>
+        <w:tc>
+          <w:tcPr>
+            <w:tcMar>
+              <w:top w:w="28.34645669291339" w:type="dxa"/>
+              <w:left w:w="28.34645669291339" w:type="dxa"/>
+              <w:bottom w:w="28.34645669291339" w:type="dxa"/>
+              <w:right w:w="28.34645669291339" w:type="dxa"/>
+            </w:tcMar>
+          </w:tcPr>
+          <w:p>
+            <w:pPr>
+              <w:widowControl w:val="0"/>
+              <w:spacing w:line="240" w:lineRule="auto"/>
+              <w:rPr/>
+            </w:pPr>
+            <w:r>
+              <w:rPr>
+                <w:rtl w:val="0"/>
+              </w:rPr>
+            </w:r>
+          </w:p>
+        </w:tc>
+      </w:tr>
+      <w:tr>
+        <w:trPr>
+          <w:cantSplit w:val="1"/>
+          <w:tblHeader w:val="0"/>
+        </w:trPr>
+        <w:tc>
+          <w:tcPr>
+            <w:tcMar>
+              <w:top w:w="28.34645669291339" w:type="dxa"/>
+              <w:left w:w="28.34645669291339" w:type="dxa"/>
+              <w:bottom w:w="28.34645669291339" w:type="dxa"/>
+              <w:right w:w="28.34645669291339" w:type="dxa"/>
+            </w:tcMar>
+          </w:tcPr>
+          <w:p>
+            <w:pPr>
+              <w:widowControl w:val="0"/>
+              <w:spacing w:line="240" w:lineRule="auto"/>
+              <w:rPr>
+                <w:b w:val="1"/>
+                <w:bCs w:val="1"/>
+              </w:rPr>
+            </w:pPr>
+            <w:r>
+              <w:rPr>
+                <w:b w:val="1"/>
+                <w:bCs w:val="1"/>
+                <w:rtl w:val="0"/>
+              </w:rPr>
+              <w:t xml:space="preserve">Impedimentos</w:t>
+            </w:r>
+          </w:p>
+        </w:tc>
+        <w:tc>
+          <w:tcPr>
+            <w:tcMar>
+              <w:top w:w="28.34645669291339" w:type="dxa"/>
+              <w:left w:w="28.34645669291339" w:type="dxa"/>
+              <w:bottom w:w="28.34645669291339" w:type="dxa"/>
+              <w:right w:w="28.34645669291339" w:type="dxa"/>
+            </w:tcMar>
+          </w:tcPr>
+          <w:p>
+            <w:pPr>
+              <w:widowControl w:val="0"/>
+              <w:spacing w:line="240" w:lineRule="auto"/>
+              <w:rPr/>
+            </w:pPr>
+            <w:r>
+              <w:rPr>
+                <w:rtl w:val="0"/>
+              </w:rPr>
+              <w:t xml:space="preserve">No Aplica</w:t>
+            </w:r>
+          </w:p>
+        </w:tc>
+      </w:tr>
+    </w:tbl>
+    <w:p>
+      <w:pPr>
+        <w:rPr/>
+      </w:pPr>
+      <w:r>
+        <w:rPr>
+          <w:rtl w:val="0"/>
+        </w:rPr>
+      </w:r>
+    </w:p>
+    <w:tbl>
+      <w:tblPr>
+        <w:tblStyle w:val="Table39"/>
+        <w:tblW w:w="8503.937007874018" w:type="dxa"/>
+        <w:jc w:val="center"/>
+        <w:tblBorders>
+          <w:top w:color="000000" w:space="0" w:sz="8" w:val="single"/>
+          <w:left w:color="000000" w:space="0" w:sz="8" w:val="single"/>
+          <w:bottom w:color="000000" w:space="0" w:sz="8" w:val="single"/>
+          <w:right w:color="000000" w:space="0" w:sz="8" w:val="single"/>
+          <w:insideH w:color="000000" w:space="0" w:sz="8" w:val="single"/>
+          <w:insideV w:color="000000" w:space="0" w:sz="8" w:val="single"/>
+        </w:tblBorders>
+        <w:tblLayout w:type="fixed"/>
+        <w:tblLook w:val="0600"/>
+      </w:tblPr>
+      <w:tblGrid>
+        <w:gridCol w:w="2267.716535433071"/>
+        <w:gridCol w:w="6236.220472440946"/>
+        <w:tblGridChange w:id="0">
+          <w:tblGrid>
+            <w:gridCol w:w="2267.716535433071"/>
+            <w:gridCol w:w="6236.220472440946"/>
+          </w:tblGrid>
+        </w:tblGridChange>
+      </w:tblGrid>
+      <w:tr>
+        <w:trPr>
+          <w:cantSplit w:val="1"/>
+          <w:tblHeader w:val="0"/>
+        </w:trPr>
+        <w:tc>
+          <w:tcPr>
+            <w:shd w:fill="cfe2f3" w:val="clear"/>
+            <w:tcMar>
+              <w:top w:w="28.34645669291339" w:type="dxa"/>
+              <w:left w:w="28.34645669291339" w:type="dxa"/>
+              <w:bottom w:w="28.34645669291339" w:type="dxa"/>
+              <w:right w:w="28.34645669291339" w:type="dxa"/>
+            </w:tcMar>
+          </w:tcPr>
+          <w:p>
+            <w:pPr>
+              <w:widowControl w:val="0"/>
+              <w:spacing w:line="240" w:lineRule="auto"/>
+              <w:jc w:val="center"/>
+              <w:rPr>
+                <w:b w:val="1"/>
+                <w:bCs w:val="1"/>
+              </w:rPr>
+            </w:pPr>
+            <w:r>
+              <w:rPr>
+                <w:b w:val="1"/>
+                <w:bCs w:val="1"/>
+                <w:rtl w:val="0"/>
+              </w:rPr>
+              <w:t xml:space="preserve">Fecha: 16-10-2026</w:t>
+            </w:r>
+          </w:p>
+        </w:tc>
+        <w:tc>
+          <w:tcPr>
+            <w:shd w:fill="cfe2f3" w:val="clear"/>
+            <w:tcMar>
+              <w:top w:w="28.34645669291339" w:type="dxa"/>
+              <w:left w:w="28.34645669291339" w:type="dxa"/>
+              <w:bottom w:w="28.34645669291339" w:type="dxa"/>
+              <w:right w:w="28.34645669291339" w:type="dxa"/>
+            </w:tcMar>
+          </w:tcPr>
+          <w:p>
+            <w:pPr>
+              <w:widowControl w:val="0"/>
+              <w:spacing w:line="240" w:lineRule="auto"/>
+              <w:rPr>
+                <w:b w:val="1"/>
+                <w:bCs w:val="1"/>
+              </w:rPr>
+            </w:pPr>
+            <w:r>
+              <w:rPr>
+                <w:b w:val="1"/>
+                <w:bCs w:val="1"/>
+                <w:rtl w:val="0"/>
+              </w:rPr>
+              <w:t xml:space="preserve">Sprint: 2</w:t>
+            </w:r>
+          </w:p>
+        </w:tc>
+      </w:tr>
+      <w:tr>
+        <w:trPr>
+          <w:cantSplit w:val="1"/>
+          <w:tblHeader w:val="0"/>
+        </w:trPr>
+        <w:tc>
+          <w:tcPr>
+            <w:tcMar>
+              <w:top w:w="28.34645669291339" w:type="dxa"/>
+              <w:left w:w="28.34645669291339" w:type="dxa"/>
+              <w:bottom w:w="28.34645669291339" w:type="dxa"/>
+              <w:right w:w="28.34645669291339" w:type="dxa"/>
+            </w:tcMar>
+          </w:tcPr>
+          <w:p>
+            <w:pPr>
+              <w:widowControl w:val="0"/>
+              <w:spacing w:line="240" w:lineRule="auto"/>
+              <w:rPr>
+                <w:b w:val="1"/>
+                <w:bCs w:val="1"/>
+              </w:rPr>
+            </w:pPr>
+            <w:r>
+              <w:rPr>
+                <w:b w:val="1"/>
+                <w:bCs w:val="1"/>
+                <w:rtl w:val="0"/>
+              </w:rPr>
+              <w:t xml:space="preserve">Que se hizo</w:t>
+            </w:r>
+          </w:p>
+        </w:tc>
+        <w:tc>
+          <w:tcPr>
+            <w:tcMar>
+              <w:top w:w="28.34645669291339" w:type="dxa"/>
+              <w:left w:w="28.34645669291339" w:type="dxa"/>
+              <w:bottom w:w="28.34645669291339" w:type="dxa"/>
+              <w:right w:w="28.34645669291339" w:type="dxa"/>
+            </w:tcMar>
+          </w:tcPr>
+          <w:p>
+            <w:pPr>
+              <w:widowControl w:val="0"/>
+              <w:spacing w:line="240" w:lineRule="auto"/>
+              <w:rPr/>
+            </w:pPr>
+            <w:r>
+              <w:rPr>
+                <w:rtl w:val="0"/>
+              </w:rPr>
+            </w:r>
+          </w:p>
+        </w:tc>
+      </w:tr>
+      <w:tr>
+        <w:trPr>
+          <w:cantSplit w:val="1"/>
+          <w:tblHeader w:val="0"/>
+        </w:trPr>
+        <w:tc>
+          <w:tcPr>
+            <w:tcMar>
+              <w:top w:w="28.34645669291339" w:type="dxa"/>
+              <w:left w:w="28.34645669291339" w:type="dxa"/>
+              <w:bottom w:w="28.34645669291339" w:type="dxa"/>
+              <w:right w:w="28.34645669291339" w:type="dxa"/>
+            </w:tcMar>
+          </w:tcPr>
+          <w:p>
+            <w:pPr>
+              <w:widowControl w:val="0"/>
+              <w:spacing w:line="240" w:lineRule="auto"/>
+              <w:rPr>
+                <w:b w:val="1"/>
+                <w:bCs w:val="1"/>
+              </w:rPr>
+            </w:pPr>
+            <w:r>
+              <w:rPr>
+                <w:b w:val="1"/>
+                <w:bCs w:val="1"/>
+                <w:rtl w:val="0"/>
+              </w:rPr>
+              <w:t xml:space="preserve">Que se hará</w:t>
+            </w:r>
+          </w:p>
+        </w:tc>
+        <w:tc>
+          <w:tcPr>
+            <w:tcMar>
+              <w:top w:w="28.34645669291339" w:type="dxa"/>
+              <w:left w:w="28.34645669291339" w:type="dxa"/>
+              <w:bottom w:w="28.34645669291339" w:type="dxa"/>
+              <w:right w:w="28.34645669291339" w:type="dxa"/>
+            </w:tcMar>
+          </w:tcPr>
+          <w:p>
+            <w:pPr>
+              <w:widowControl w:val="0"/>
+              <w:spacing w:line="240" w:lineRule="auto"/>
+              <w:rPr/>
+            </w:pPr>
+            <w:r>
+              <w:rPr>
+                <w:rtl w:val="0"/>
+              </w:rPr>
+            </w:r>
+          </w:p>
+        </w:tc>
+      </w:tr>
+      <w:tr>
+        <w:trPr>
+          <w:cantSplit w:val="1"/>
+          <w:tblHeader w:val="0"/>
+        </w:trPr>
+        <w:tc>
+          <w:tcPr>
+            <w:tcMar>
+              <w:top w:w="28.34645669291339" w:type="dxa"/>
+              <w:left w:w="28.34645669291339" w:type="dxa"/>
+              <w:bottom w:w="28.34645669291339" w:type="dxa"/>
+              <w:right w:w="28.34645669291339" w:type="dxa"/>
+            </w:tcMar>
+          </w:tcPr>
+          <w:p>
+            <w:pPr>
+              <w:widowControl w:val="0"/>
+              <w:spacing w:line="240" w:lineRule="auto"/>
+              <w:rPr>
+                <w:b w:val="1"/>
+                <w:bCs w:val="1"/>
+              </w:rPr>
+            </w:pPr>
+            <w:r>
+              <w:rPr>
+                <w:b w:val="1"/>
+                <w:bCs w:val="1"/>
+                <w:rtl w:val="0"/>
+              </w:rPr>
+              <w:t xml:space="preserve">Impedimentos</w:t>
+            </w:r>
+          </w:p>
+        </w:tc>
+        <w:tc>
+          <w:tcPr>
+            <w:tcMar>
+              <w:top w:w="28.34645669291339" w:type="dxa"/>
+              <w:left w:w="28.34645669291339" w:type="dxa"/>
+              <w:bottom w:w="28.34645669291339" w:type="dxa"/>
+              <w:right w:w="28.34645669291339" w:type="dxa"/>
+            </w:tcMar>
+          </w:tcPr>
+          <w:p>
+            <w:pPr>
+              <w:widowControl w:val="0"/>
+              <w:spacing w:line="240" w:lineRule="auto"/>
+              <w:rPr/>
+            </w:pPr>
+            <w:r>
+              <w:rPr>
+                <w:rtl w:val="0"/>
+              </w:rPr>
+              <w:t xml:space="preserve">No Aplica</w:t>
+            </w:r>
+          </w:p>
+        </w:tc>
+      </w:tr>
+    </w:tbl>
+    <w:p>
+      <w:pPr>
+        <w:rPr/>
+      </w:pPr>
+      <w:r>
+        <w:rPr>
+          <w:rtl w:val="0"/>
+        </w:rPr>
+      </w:r>
+    </w:p>
+    <w:tbl>
+      <w:tblPr>
+        <w:tblStyle w:val="Table40"/>
+        <w:tblW w:w="8503.937007874018" w:type="dxa"/>
+        <w:jc w:val="center"/>
+        <w:tblBorders>
+          <w:top w:color="000000" w:space="0" w:sz="8" w:val="single"/>
+          <w:left w:color="000000" w:space="0" w:sz="8" w:val="single"/>
+          <w:bottom w:color="000000" w:space="0" w:sz="8" w:val="single"/>
+          <w:right w:color="000000" w:space="0" w:sz="8" w:val="single"/>
+          <w:insideH w:color="000000" w:space="0" w:sz="8" w:val="single"/>
+          <w:insideV w:color="000000" w:space="0" w:sz="8" w:val="single"/>
+        </w:tblBorders>
+        <w:tblLayout w:type="fixed"/>
+        <w:tblLook w:val="0600"/>
+      </w:tblPr>
+      <w:tblGrid>
+        <w:gridCol w:w="2267.716535433071"/>
+        <w:gridCol w:w="6236.220472440946"/>
+        <w:tblGridChange w:id="0">
+          <w:tblGrid>
+            <w:gridCol w:w="2267.716535433071"/>
+            <w:gridCol w:w="6236.220472440946"/>
+          </w:tblGrid>
+        </w:tblGridChange>
+      </w:tblGrid>
+      <w:tr>
+        <w:trPr>
+          <w:cantSplit w:val="1"/>
+          <w:tblHeader w:val="0"/>
+        </w:trPr>
+        <w:tc>
+          <w:tcPr>
+            <w:shd w:fill="cfe2f3" w:val="clear"/>
+            <w:tcMar>
+              <w:top w:w="28.34645669291339" w:type="dxa"/>
+              <w:left w:w="28.34645669291339" w:type="dxa"/>
+              <w:bottom w:w="28.34645669291339" w:type="dxa"/>
+              <w:right w:w="28.34645669291339" w:type="dxa"/>
+            </w:tcMar>
+          </w:tcPr>
+          <w:p>
+            <w:pPr>
+              <w:widowControl w:val="0"/>
+              <w:spacing w:line="240" w:lineRule="auto"/>
+              <w:jc w:val="center"/>
+              <w:rPr>
+                <w:b w:val="1"/>
+                <w:bCs w:val="1"/>
+              </w:rPr>
+            </w:pPr>
+            <w:r>
+              <w:rPr>
+                <w:b w:val="1"/>
+                <w:bCs w:val="1"/>
+                <w:rtl w:val="0"/>
+              </w:rPr>
+              <w:t xml:space="preserve">Fecha: 17-10-2026</w:t>
+            </w:r>
+          </w:p>
+        </w:tc>
+        <w:tc>
+          <w:tcPr>
+            <w:shd w:fill="cfe2f3" w:val="clear"/>
+            <w:tcMar>
+              <w:top w:w="28.34645669291339" w:type="dxa"/>
+              <w:left w:w="28.34645669291339" w:type="dxa"/>
+              <w:bottom w:w="28.34645669291339" w:type="dxa"/>
+              <w:right w:w="28.34645669291339" w:type="dxa"/>
+            </w:tcMar>
+          </w:tcPr>
+          <w:p>
+            <w:pPr>
+              <w:widowControl w:val="0"/>
+              <w:spacing w:line="240" w:lineRule="auto"/>
+              <w:rPr>
+                <w:b w:val="1"/>
+                <w:bCs w:val="1"/>
+              </w:rPr>
+            </w:pPr>
+            <w:r>
+              <w:rPr>
+                <w:b w:val="1"/>
+                <w:bCs w:val="1"/>
+                <w:rtl w:val="0"/>
+              </w:rPr>
+              <w:t xml:space="preserve">Sprint: 2</w:t>
+            </w:r>
+          </w:p>
+        </w:tc>
+      </w:tr>
+      <w:tr>
+        <w:trPr>
+          <w:cantSplit w:val="1"/>
+          <w:tblHeader w:val="0"/>
+        </w:trPr>
+        <w:tc>
+          <w:tcPr>
+            <w:tcMar>
+              <w:top w:w="28.34645669291339" w:type="dxa"/>
+              <w:left w:w="28.34645669291339" w:type="dxa"/>
+              <w:bottom w:w="28.34645669291339" w:type="dxa"/>
+              <w:right w:w="28.34645669291339" w:type="dxa"/>
+            </w:tcMar>
+          </w:tcPr>
+          <w:p>
+            <w:pPr>
+              <w:widowControl w:val="0"/>
+              <w:spacing w:line="240" w:lineRule="auto"/>
+              <w:rPr>
+                <w:b w:val="1"/>
+                <w:bCs w:val="1"/>
+              </w:rPr>
+            </w:pPr>
+            <w:r>
+              <w:rPr>
+                <w:b w:val="1"/>
+                <w:bCs w:val="1"/>
+                <w:rtl w:val="0"/>
+              </w:rPr>
+              <w:t xml:space="preserve">Que se hizo</w:t>
+            </w:r>
+          </w:p>
+        </w:tc>
+        <w:tc>
+          <w:tcPr>
+            <w:tcMar>
+              <w:top w:w="28.34645669291339" w:type="dxa"/>
+              <w:left w:w="28.34645669291339" w:type="dxa"/>
+              <w:bottom w:w="28.34645669291339" w:type="dxa"/>
+              <w:right w:w="28.34645669291339" w:type="dxa"/>
+            </w:tcMar>
+          </w:tcPr>
+          <w:p>
+            <w:pPr>
+              <w:widowControl w:val="0"/>
+              <w:spacing w:line="240" w:lineRule="auto"/>
+              <w:rPr/>
+            </w:pPr>
+            <w:r>
+              <w:rPr>
+                <w:rtl w:val="0"/>
+              </w:rPr>
+            </w:r>
+          </w:p>
+        </w:tc>
+      </w:tr>
+      <w:tr>
+        <w:trPr>
+          <w:cantSplit w:val="1"/>
+          <w:tblHeader w:val="0"/>
+        </w:trPr>
+        <w:tc>
+          <w:tcPr>
+            <w:tcMar>
+              <w:top w:w="28.34645669291339" w:type="dxa"/>
+              <w:left w:w="28.34645669291339" w:type="dxa"/>
+              <w:bottom w:w="28.34645669291339" w:type="dxa"/>
+              <w:right w:w="28.34645669291339" w:type="dxa"/>
+            </w:tcMar>
+          </w:tcPr>
+          <w:p>
+            <w:pPr>
+              <w:widowControl w:val="0"/>
+              <w:spacing w:line="240" w:lineRule="auto"/>
+              <w:rPr>
+                <w:b w:val="1"/>
+                <w:bCs w:val="1"/>
+              </w:rPr>
+            </w:pPr>
+            <w:r>
+              <w:rPr>
+                <w:b w:val="1"/>
+                <w:bCs w:val="1"/>
+                <w:rtl w:val="0"/>
+              </w:rPr>
+              <w:t xml:space="preserve">Que se hará</w:t>
+            </w:r>
+          </w:p>
+        </w:tc>
+        <w:tc>
+          <w:tcPr>
+            <w:tcMar>
+              <w:top w:w="28.34645669291339" w:type="dxa"/>
+              <w:left w:w="28.34645669291339" w:type="dxa"/>
+              <w:bottom w:w="28.34645669291339" w:type="dxa"/>
+              <w:right w:w="28.34645669291339" w:type="dxa"/>
+            </w:tcMar>
+          </w:tcPr>
+          <w:p>
+            <w:pPr>
+              <w:widowControl w:val="0"/>
+              <w:spacing w:line="240" w:lineRule="auto"/>
+              <w:rPr/>
+            </w:pPr>
+            <w:r>
+              <w:rPr>
+                <w:rtl w:val="0"/>
+              </w:rPr>
+            </w:r>
+          </w:p>
+        </w:tc>
+      </w:tr>
+      <w:tr>
+        <w:trPr>
+          <w:cantSplit w:val="1"/>
+          <w:tblHeader w:val="0"/>
+        </w:trPr>
+        <w:tc>
+          <w:tcPr>
+            <w:tcMar>
+              <w:top w:w="28.34645669291339" w:type="dxa"/>
+              <w:left w:w="28.34645669291339" w:type="dxa"/>
+              <w:bottom w:w="28.34645669291339" w:type="dxa"/>
+              <w:right w:w="28.34645669291339" w:type="dxa"/>
+            </w:tcMar>
+          </w:tcPr>
+          <w:p>
+            <w:pPr>
+              <w:widowControl w:val="0"/>
+              <w:spacing w:line="240" w:lineRule="auto"/>
+              <w:rPr>
+                <w:b w:val="1"/>
+                <w:bCs w:val="1"/>
+              </w:rPr>
+            </w:pPr>
+            <w:r>
+              <w:rPr>
+                <w:b w:val="1"/>
+                <w:bCs w:val="1"/>
+                <w:rtl w:val="0"/>
+              </w:rPr>
+              <w:t xml:space="preserve">Impedimentos</w:t>
+            </w:r>
+          </w:p>
+        </w:tc>
+        <w:tc>
+          <w:tcPr>
+            <w:tcMar>
+              <w:top w:w="28.34645669291339" w:type="dxa"/>
+              <w:left w:w="28.34645669291339" w:type="dxa"/>
+              <w:bottom w:w="28.34645669291339" w:type="dxa"/>
+              <w:right w:w="28.34645669291339" w:type="dxa"/>
+            </w:tcMar>
+          </w:tcPr>
+          <w:p>
+            <w:pPr>
+              <w:widowControl w:val="0"/>
+              <w:spacing w:line="240" w:lineRule="auto"/>
+              <w:rPr/>
+            </w:pPr>
+            <w:r>
+              <w:rPr>
+                <w:rtl w:val="0"/>
+              </w:rPr>
+              <w:t xml:space="preserve">No Aplica</w:t>
+            </w:r>
+          </w:p>
+        </w:tc>
+      </w:tr>
+    </w:tbl>
+    <w:p>
+      <w:pPr>
+        <w:rPr/>
+      </w:pPr>
+      <w:r>
+        <w:rPr>
+          <w:rtl w:val="0"/>
+        </w:rPr>
+      </w:r>
+    </w:p>
+    <w:tbl>
+      <w:tblPr>
+        <w:tblStyle w:val="Table41"/>
+        <w:tblW w:w="8503.937007874018" w:type="dxa"/>
+        <w:jc w:val="center"/>
+        <w:tblBorders>
+          <w:top w:color="000000" w:space="0" w:sz="8" w:val="single"/>
+          <w:left w:color="000000" w:space="0" w:sz="8" w:val="single"/>
+          <w:bottom w:color="000000" w:space="0" w:sz="8" w:val="single"/>
+          <w:right w:color="000000" w:space="0" w:sz="8" w:val="single"/>
+          <w:insideH w:color="000000" w:space="0" w:sz="8" w:val="single"/>
+          <w:insideV w:color="000000" w:space="0" w:sz="8" w:val="single"/>
+        </w:tblBorders>
+        <w:tblLayout w:type="fixed"/>
+        <w:tblLook w:val="0600"/>
+      </w:tblPr>
+      <w:tblGrid>
+        <w:gridCol w:w="2267.716535433071"/>
+        <w:gridCol w:w="6236.220472440946"/>
+        <w:tblGridChange w:id="0">
+          <w:tblGrid>
+            <w:gridCol w:w="2267.716535433071"/>
+            <w:gridCol w:w="6236.220472440946"/>
+          </w:tblGrid>
+        </w:tblGridChange>
+      </w:tblGrid>
+      <w:tr>
+        <w:trPr>
+          <w:cantSplit w:val="1"/>
+          <w:tblHeader w:val="0"/>
+        </w:trPr>
+        <w:tc>
+          <w:tcPr>
+            <w:shd w:fill="cfe2f3" w:val="clear"/>
+            <w:tcMar>
+              <w:top w:w="28.34645669291339" w:type="dxa"/>
+              <w:left w:w="28.34645669291339" w:type="dxa"/>
+              <w:bottom w:w="28.34645669291339" w:type="dxa"/>
+              <w:right w:w="28.34645669291339" w:type="dxa"/>
+            </w:tcMar>
+          </w:tcPr>
+          <w:p>
+            <w:pPr>
+              <w:widowControl w:val="0"/>
+              <w:spacing w:line="240" w:lineRule="auto"/>
+              <w:jc w:val="center"/>
+              <w:rPr>
+                <w:b w:val="1"/>
+                <w:bCs w:val="1"/>
+              </w:rPr>
+            </w:pPr>
+            <w:r>
+              <w:rPr>
+                <w:b w:val="1"/>
+                <w:bCs w:val="1"/>
+                <w:rtl w:val="0"/>
+              </w:rPr>
+              <w:t xml:space="preserve">Fecha: 18-10-2026</w:t>
+            </w:r>
+          </w:p>
+        </w:tc>
+        <w:tc>
+          <w:tcPr>
+            <w:shd w:fill="cfe2f3" w:val="clear"/>
+            <w:tcMar>
+              <w:top w:w="28.34645669291339" w:type="dxa"/>
+              <w:left w:w="28.34645669291339" w:type="dxa"/>
+              <w:bottom w:w="28.34645669291339" w:type="dxa"/>
+              <w:right w:w="28.34645669291339" w:type="dxa"/>
+            </w:tcMar>
+          </w:tcPr>
+          <w:p>
+            <w:pPr>
+              <w:widowControl w:val="0"/>
+              <w:spacing w:line="240" w:lineRule="auto"/>
+              <w:rPr>
+                <w:b w:val="1"/>
+                <w:bCs w:val="1"/>
+              </w:rPr>
+            </w:pPr>
+            <w:r>
+              <w:rPr>
+                <w:b w:val="1"/>
+                <w:bCs w:val="1"/>
+                <w:rtl w:val="0"/>
+              </w:rPr>
+              <w:t xml:space="preserve">Sprint: 2</w:t>
+            </w:r>
+          </w:p>
+        </w:tc>
+      </w:tr>
+      <w:tr>
+        <w:trPr>
+          <w:cantSplit w:val="1"/>
+          <w:tblHeader w:val="0"/>
+        </w:trPr>
+        <w:tc>
+          <w:tcPr>
+            <w:tcMar>
+              <w:top w:w="28.34645669291339" w:type="dxa"/>
+              <w:left w:w="28.34645669291339" w:type="dxa"/>
+              <w:bottom w:w="28.34645669291339" w:type="dxa"/>
+              <w:right w:w="28.34645669291339" w:type="dxa"/>
+            </w:tcMar>
+          </w:tcPr>
+          <w:p>
+            <w:pPr>
+              <w:widowControl w:val="0"/>
+              <w:spacing w:line="240" w:lineRule="auto"/>
+              <w:rPr>
+                <w:b w:val="1"/>
+                <w:bCs w:val="1"/>
+              </w:rPr>
+            </w:pPr>
+            <w:r>
+              <w:rPr>
+                <w:b w:val="1"/>
+                <w:bCs w:val="1"/>
+                <w:rtl w:val="0"/>
+              </w:rPr>
+              <w:t xml:space="preserve">Que se hizo</w:t>
+            </w:r>
+          </w:p>
+        </w:tc>
+        <w:tc>
+          <w:tcPr>
+            <w:tcMar>
+              <w:top w:w="28.34645669291339" w:type="dxa"/>
+              <w:left w:w="28.34645669291339" w:type="dxa"/>
+              <w:bottom w:w="28.34645669291339" w:type="dxa"/>
+              <w:right w:w="28.34645669291339" w:type="dxa"/>
+            </w:tcMar>
+          </w:tcPr>
+          <w:p>
+            <w:pPr>
+              <w:widowControl w:val="0"/>
+              <w:spacing w:line="240" w:lineRule="auto"/>
+              <w:rPr/>
+            </w:pPr>
+            <w:r>
+              <w:rPr>
+                <w:rtl w:val="0"/>
+              </w:rPr>
+            </w:r>
+          </w:p>
+        </w:tc>
+      </w:tr>
+      <w:tr>
+        <w:trPr>
+          <w:cantSplit w:val="1"/>
+          <w:tblHeader w:val="0"/>
+        </w:trPr>
+        <w:tc>
+          <w:tcPr>
+            <w:tcMar>
+              <w:top w:w="28.34645669291339" w:type="dxa"/>
+              <w:left w:w="28.34645669291339" w:type="dxa"/>
+              <w:bottom w:w="28.34645669291339" w:type="dxa"/>
+              <w:right w:w="28.34645669291339" w:type="dxa"/>
+            </w:tcMar>
+          </w:tcPr>
+          <w:p>
+            <w:pPr>
+              <w:widowControl w:val="0"/>
+              <w:spacing w:line="240" w:lineRule="auto"/>
+              <w:rPr>
+                <w:b w:val="1"/>
+                <w:bCs w:val="1"/>
+              </w:rPr>
+            </w:pPr>
+            <w:r>
+              <w:rPr>
+                <w:b w:val="1"/>
+                <w:bCs w:val="1"/>
+                <w:rtl w:val="0"/>
+              </w:rPr>
+              <w:t xml:space="preserve">Que se hará</w:t>
+            </w:r>
+          </w:p>
+        </w:tc>
+        <w:tc>
+          <w:tcPr>
+            <w:tcMar>
+              <w:top w:w="28.34645669291339" w:type="dxa"/>
+              <w:left w:w="28.34645669291339" w:type="dxa"/>
+              <w:bottom w:w="28.34645669291339" w:type="dxa"/>
+              <w:right w:w="28.34645669291339" w:type="dxa"/>
+            </w:tcMar>
+          </w:tcPr>
+          <w:p>
+            <w:pPr>
+              <w:widowControl w:val="0"/>
+              <w:spacing w:line="240" w:lineRule="auto"/>
+              <w:rPr/>
+            </w:pPr>
+            <w:r>
+              <w:rPr>
+                <w:rtl w:val="0"/>
+              </w:rPr>
+            </w:r>
+          </w:p>
+        </w:tc>
+      </w:tr>
+      <w:tr>
+        <w:trPr>
+          <w:cantSplit w:val="1"/>
+          <w:tblHeader w:val="0"/>
+        </w:trPr>
+        <w:tc>
+          <w:tcPr>
+            <w:tcMar>
+              <w:top w:w="28.34645669291339" w:type="dxa"/>
+              <w:left w:w="28.34645669291339" w:type="dxa"/>
+              <w:bottom w:w="28.34645669291339" w:type="dxa"/>
+              <w:right w:w="28.34645669291339" w:type="dxa"/>
+            </w:tcMar>
+          </w:tcPr>
+          <w:p>
+            <w:pPr>
+              <w:widowControl w:val="0"/>
+              <w:spacing w:line="240" w:lineRule="auto"/>
+              <w:rPr>
+                <w:b w:val="1"/>
+                <w:bCs w:val="1"/>
+              </w:rPr>
+            </w:pPr>
+            <w:r>
+              <w:rPr>
+                <w:b w:val="1"/>
+                <w:bCs w:val="1"/>
+                <w:rtl w:val="0"/>
+              </w:rPr>
+              <w:t xml:space="preserve">Impedimentos</w:t>
+            </w:r>
+          </w:p>
+        </w:tc>
+        <w:tc>
+          <w:tcPr>
+            <w:tcMar>
+              <w:top w:w="28.34645669291339" w:type="dxa"/>
+              <w:left w:w="28.34645669291339" w:type="dxa"/>
+              <w:bottom w:w="28.34645669291339" w:type="dxa"/>
+              <w:right w:w="28.34645669291339" w:type="dxa"/>
+            </w:tcMar>
+          </w:tcPr>
+          <w:p>
+            <w:pPr>
+              <w:widowControl w:val="0"/>
+              <w:spacing w:line="240" w:lineRule="auto"/>
+              <w:rPr/>
+            </w:pPr>
+            <w:r>
+              <w:rPr>
+                <w:rtl w:val="0"/>
+              </w:rPr>
+              <w:t xml:space="preserve">No Aplica</w:t>
+            </w:r>
+          </w:p>
+        </w:tc>
+      </w:tr>
+    </w:tbl>
+    <w:p>
+      <w:pPr>
+        <w:rPr/>
+      </w:pPr>
+      <w:r>
+        <w:br w:type="page"/>
+      </w:r>
+      <w:r>
+        <w:rPr>
+          <w:rtl w:val="0"/>
+        </w:rPr>
+      </w:r>
+    </w:p>
+    <w:p>
+      <w:pPr>
+        <w:jc w:val="center"/>
+        <w:rPr/>
+      </w:pPr>
+      <w:r>
+        <w:rPr>
+          <w:b w:val="1"/>
+          <w:bCs w:val="1"/>
+          <w:highlight w:val="yellow"/>
+          <w:rtl w:val="0"/>
+        </w:rPr>
+        <w:t xml:space="preserve">SPRINT 3</w:t>
+      </w:r>
+      <w:r>
+        <w:rPr>
+          <w:rtl w:val="0"/>
+        </w:rPr>
+      </w:r>
+    </w:p>
+    <w:p>
+      <w:pPr>
+        <w:rPr/>
+      </w:pPr>
+      <w:r>
+        <w:rPr>
+          <w:rtl w:val="0"/>
+        </w:rPr>
+      </w:r>
+    </w:p>
+    <w:tbl>
+      <w:tblPr>
+        <w:tblStyle w:val="Table42"/>
+        <w:tblW w:w="8503.937007874018" w:type="dxa"/>
+        <w:jc w:val="center"/>
+        <w:tblBorders>
+          <w:top w:color="000000" w:space="0" w:sz="8" w:val="single"/>
+          <w:left w:color="000000" w:space="0" w:sz="8" w:val="single"/>
+          <w:bottom w:color="000000" w:space="0" w:sz="8" w:val="single"/>
+          <w:right w:color="000000" w:space="0" w:sz="8" w:val="single"/>
+          <w:insideH w:color="000000" w:space="0" w:sz="8" w:val="single"/>
+          <w:insideV w:color="000000" w:space="0" w:sz="8" w:val="single"/>
+        </w:tblBorders>
+        <w:tblLayout w:type="fixed"/>
+        <w:tblLook w:val="0600"/>
+      </w:tblPr>
+      <w:tblGrid>
+        <w:gridCol w:w="2267.716535433071"/>
+        <w:gridCol w:w="6236.220472440946"/>
+        <w:tblGridChange w:id="0">
+          <w:tblGrid>
+            <w:gridCol w:w="2267.716535433071"/>
+            <w:gridCol w:w="6236.220472440946"/>
+          </w:tblGrid>
+        </w:tblGridChange>
+      </w:tblGrid>
+      <w:tr>
+        <w:trPr>
+          <w:cantSplit w:val="1"/>
+          <w:tblHeader w:val="0"/>
+        </w:trPr>
+        <w:tc>
+          <w:tcPr>
+            <w:shd w:fill="cfe2f3" w:val="clear"/>
+            <w:tcMar>
+              <w:top w:w="28.34645669291339" w:type="dxa"/>
+              <w:left w:w="28.34645669291339" w:type="dxa"/>
+              <w:bottom w:w="28.34645669291339" w:type="dxa"/>
+              <w:right w:w="28.34645669291339" w:type="dxa"/>
+            </w:tcMar>
+          </w:tcPr>
+          <w:p>
+            <w:pPr>
+              <w:widowControl w:val="0"/>
+              <w:spacing w:line="240" w:lineRule="auto"/>
+              <w:jc w:val="center"/>
+              <w:rPr>
+                <w:b w:val="1"/>
+                <w:bCs w:val="1"/>
+              </w:rPr>
+            </w:pPr>
+            <w:r>
+              <w:rPr>
+                <w:b w:val="1"/>
+                <w:bCs w:val="1"/>
+                <w:rtl w:val="0"/>
+              </w:rPr>
+              <w:t xml:space="preserve">Fecha: 19-10-2026</w:t>
+            </w:r>
+          </w:p>
+        </w:tc>
+        <w:tc>
+          <w:tcPr>
+            <w:shd w:fill="cfe2f3" w:val="clear"/>
+            <w:tcMar>
+              <w:top w:w="28.34645669291339" w:type="dxa"/>
+              <w:left w:w="28.34645669291339" w:type="dxa"/>
+              <w:bottom w:w="28.34645669291339" w:type="dxa"/>
+              <w:right w:w="28.34645669291339" w:type="dxa"/>
+            </w:tcMar>
+          </w:tcPr>
+          <w:p>
+            <w:pPr>
+              <w:widowControl w:val="0"/>
+              <w:spacing w:line="240" w:lineRule="auto"/>
+              <w:rPr>
+                <w:b w:val="1"/>
+                <w:bCs w:val="1"/>
+              </w:rPr>
+            </w:pPr>
+            <w:r>
+              <w:rPr>
+                <w:b w:val="1"/>
+                <w:bCs w:val="1"/>
+                <w:rtl w:val="0"/>
+              </w:rPr>
+              <w:t xml:space="preserve">Sprint: 2</w:t>
+            </w:r>
+          </w:p>
+        </w:tc>
+      </w:tr>
+      <w:tr>
+        <w:trPr>
+          <w:cantSplit w:val="1"/>
+          <w:tblHeader w:val="0"/>
+        </w:trPr>
+        <w:tc>
+          <w:tcPr>
+            <w:tcMar>
+              <w:top w:w="28.34645669291339" w:type="dxa"/>
+              <w:left w:w="28.34645669291339" w:type="dxa"/>
+              <w:bottom w:w="28.34645669291339" w:type="dxa"/>
+              <w:right w:w="28.34645669291339" w:type="dxa"/>
+            </w:tcMar>
+          </w:tcPr>
+          <w:p>
+            <w:pPr>
+              <w:widowControl w:val="0"/>
+              <w:spacing w:line="240" w:lineRule="auto"/>
+              <w:rPr>
+                <w:b w:val="1"/>
+                <w:bCs w:val="1"/>
+              </w:rPr>
+            </w:pPr>
+            <w:r>
+              <w:rPr>
+                <w:b w:val="1"/>
+                <w:bCs w:val="1"/>
+                <w:rtl w:val="0"/>
+              </w:rPr>
+              <w:t xml:space="preserve">Que se hizo</w:t>
+            </w:r>
+          </w:p>
+        </w:tc>
+        <w:tc>
+          <w:tcPr>
+            <w:tcMar>
+              <w:top w:w="28.34645669291339" w:type="dxa"/>
+              <w:left w:w="28.34645669291339" w:type="dxa"/>
+              <w:bottom w:w="28.34645669291339" w:type="dxa"/>
+              <w:right w:w="28.34645669291339" w:type="dxa"/>
+            </w:tcMar>
+          </w:tcPr>
+          <w:p>
+            <w:pPr>
+              <w:widowControl w:val="0"/>
+              <w:spacing w:line="240" w:lineRule="auto"/>
+              <w:rPr/>
+            </w:pPr>
+            <w:r>
+              <w:rPr>
+                <w:rtl w:val="0"/>
+              </w:rPr>
+            </w:r>
+          </w:p>
+        </w:tc>
+      </w:tr>
+      <w:tr>
+        <w:trPr>
+          <w:cantSplit w:val="1"/>
+          <w:tblHeader w:val="0"/>
+        </w:trPr>
+        <w:tc>
+          <w:tcPr>
+            <w:tcMar>
+              <w:top w:w="28.34645669291339" w:type="dxa"/>
+              <w:left w:w="28.34645669291339" w:type="dxa"/>
+              <w:bottom w:w="28.34645669291339" w:type="dxa"/>
+              <w:right w:w="28.34645669291339" w:type="dxa"/>
+            </w:tcMar>
+          </w:tcPr>
+          <w:p>
+            <w:pPr>
+              <w:widowControl w:val="0"/>
+              <w:spacing w:line="240" w:lineRule="auto"/>
+              <w:rPr>
+                <w:b w:val="1"/>
+                <w:bCs w:val="1"/>
+              </w:rPr>
+            </w:pPr>
+            <w:r>
+              <w:rPr>
+                <w:b w:val="1"/>
+                <w:bCs w:val="1"/>
+                <w:rtl w:val="0"/>
+              </w:rPr>
+              <w:t xml:space="preserve">Que se hará</w:t>
+            </w:r>
+          </w:p>
+        </w:tc>
+        <w:tc>
+          <w:tcPr>
+            <w:tcMar>
+              <w:top w:w="28.34645669291339" w:type="dxa"/>
+              <w:left w:w="28.34645669291339" w:type="dxa"/>
+              <w:bottom w:w="28.34645669291339" w:type="dxa"/>
+              <w:right w:w="28.34645669291339" w:type="dxa"/>
+            </w:tcMar>
+          </w:tcPr>
+          <w:p>
+            <w:pPr>
+              <w:widowControl w:val="0"/>
+              <w:spacing w:line="240" w:lineRule="auto"/>
+              <w:rPr/>
+            </w:pPr>
+            <w:r>
+              <w:rPr>
+                <w:rtl w:val="0"/>
+              </w:rPr>
+            </w:r>
+          </w:p>
+        </w:tc>
+      </w:tr>
+      <w:tr>
+        <w:trPr>
+          <w:cantSplit w:val="1"/>
+          <w:tblHeader w:val="0"/>
+        </w:trPr>
+        <w:tc>
+          <w:tcPr>
+            <w:tcMar>
+              <w:top w:w="28.34645669291339" w:type="dxa"/>
+              <w:left w:w="28.34645669291339" w:type="dxa"/>
+              <w:bottom w:w="28.34645669291339" w:type="dxa"/>
+              <w:right w:w="28.34645669291339" w:type="dxa"/>
+            </w:tcMar>
+          </w:tcPr>
+          <w:p>
+            <w:pPr>
+              <w:widowControl w:val="0"/>
+              <w:spacing w:line="240" w:lineRule="auto"/>
+              <w:rPr>
+                <w:b w:val="1"/>
+                <w:bCs w:val="1"/>
+              </w:rPr>
+            </w:pPr>
+            <w:r>
+              <w:rPr>
+                <w:b w:val="1"/>
+                <w:bCs w:val="1"/>
+                <w:rtl w:val="0"/>
+              </w:rPr>
+              <w:t xml:space="preserve">Impedimentos</w:t>
+            </w:r>
+          </w:p>
+        </w:tc>
+        <w:tc>
+          <w:tcPr>
+            <w:tcMar>
+              <w:top w:w="28.34645669291339" w:type="dxa"/>
+              <w:left w:w="28.34645669291339" w:type="dxa"/>
+              <w:bottom w:w="28.34645669291339" w:type="dxa"/>
+              <w:right w:w="28.34645669291339" w:type="dxa"/>
+            </w:tcMar>
+          </w:tcPr>
+          <w:p>
+            <w:pPr>
+              <w:widowControl w:val="0"/>
+              <w:spacing w:line="240" w:lineRule="auto"/>
+              <w:rPr/>
+            </w:pPr>
+            <w:r>
+              <w:rPr>
+                <w:rtl w:val="0"/>
+              </w:rPr>
+              <w:t xml:space="preserve">No Aplica</w:t>
+            </w:r>
+          </w:p>
+        </w:tc>
+      </w:tr>
+    </w:tbl>
+    <w:p>
+      <w:pPr>
+        <w:rPr/>
+      </w:pPr>
+      <w:r>
+        <w:rPr>
+          <w:rtl w:val="0"/>
+        </w:rPr>
+      </w:r>
+    </w:p>
+    <w:tbl>
+      <w:tblPr>
+        <w:tblStyle w:val="Table43"/>
+        <w:tblW w:w="8503.937007874018" w:type="dxa"/>
+        <w:jc w:val="center"/>
+        <w:tblBorders>
+          <w:top w:color="000000" w:space="0" w:sz="8" w:val="single"/>
+          <w:left w:color="000000" w:space="0" w:sz="8" w:val="single"/>
+          <w:bottom w:color="000000" w:space="0" w:sz="8" w:val="single"/>
+          <w:right w:color="000000" w:space="0" w:sz="8" w:val="single"/>
+          <w:insideH w:color="000000" w:space="0" w:sz="8" w:val="single"/>
+          <w:insideV w:color="000000" w:space="0" w:sz="8" w:val="single"/>
+        </w:tblBorders>
+        <w:tblLayout w:type="fixed"/>
+        <w:tblLook w:val="0600"/>
+      </w:tblPr>
+      <w:tblGrid>
+        <w:gridCol w:w="2267.716535433071"/>
+        <w:gridCol w:w="6236.220472440946"/>
+        <w:tblGridChange w:id="0">
+          <w:tblGrid>
+            <w:gridCol w:w="2267.716535433071"/>
+            <w:gridCol w:w="6236.220472440946"/>
+          </w:tblGrid>
+        </w:tblGridChange>
+      </w:tblGrid>
+      <w:tr>
+        <w:trPr>
+          <w:cantSplit w:val="1"/>
+          <w:tblHeader w:val="0"/>
+        </w:trPr>
+        <w:tc>
+          <w:tcPr>
+            <w:shd w:fill="cfe2f3" w:val="clear"/>
+            <w:tcMar>
+              <w:top w:w="28.34645669291339" w:type="dxa"/>
+              <w:left w:w="28.34645669291339" w:type="dxa"/>
+              <w:bottom w:w="28.34645669291339" w:type="dxa"/>
+              <w:right w:w="28.34645669291339" w:type="dxa"/>
+            </w:tcMar>
+          </w:tcPr>
+          <w:p>
+            <w:pPr>
+              <w:widowControl w:val="0"/>
+              <w:spacing w:line="240" w:lineRule="auto"/>
+              <w:jc w:val="center"/>
+              <w:rPr>
+                <w:b w:val="1"/>
+                <w:bCs w:val="1"/>
+              </w:rPr>
+            </w:pPr>
+            <w:r>
+              <w:rPr>
+                <w:b w:val="1"/>
+                <w:bCs w:val="1"/>
+                <w:rtl w:val="0"/>
+              </w:rPr>
+              <w:t xml:space="preserve">Fecha: 20-10-2026</w:t>
             </w:r>
           </w:p>
         </w:tc>
@@ -9732,6 +12506,76 @@
       <w:tblStyleColBandSize w:val="1"/>
     </w:tblPr>
   </w:style>
+  <w:style w:type="table" w:styleId="Table34">
+    <w:basedOn w:val="TableNormal"/>
+    <w:tblPr>
+      <w:tblStyleRowBandSize w:val="1"/>
+      <w:tblStyleColBandSize w:val="1"/>
+    </w:tblPr>
+  </w:style>
+  <w:style w:type="table" w:styleId="Table35">
+    <w:basedOn w:val="TableNormal"/>
+    <w:tblPr>
+      <w:tblStyleRowBandSize w:val="1"/>
+      <w:tblStyleColBandSize w:val="1"/>
+    </w:tblPr>
+  </w:style>
+  <w:style w:type="table" w:styleId="Table36">
+    <w:basedOn w:val="TableNormal"/>
+    <w:tblPr>
+      <w:tblStyleRowBandSize w:val="1"/>
+      <w:tblStyleColBandSize w:val="1"/>
+    </w:tblPr>
+  </w:style>
+  <w:style w:type="table" w:styleId="Table37">
+    <w:basedOn w:val="TableNormal"/>
+    <w:tblPr>
+      <w:tblStyleRowBandSize w:val="1"/>
+      <w:tblStyleColBandSize w:val="1"/>
+    </w:tblPr>
+  </w:style>
+  <w:style w:type="table" w:styleId="Table38">
+    <w:basedOn w:val="TableNormal"/>
+    <w:tblPr>
+      <w:tblStyleRowBandSize w:val="1"/>
+      <w:tblStyleColBandSize w:val="1"/>
+    </w:tblPr>
+  </w:style>
+  <w:style w:type="table" w:styleId="Table39">
+    <w:basedOn w:val="TableNormal"/>
+    <w:tblPr>
+      <w:tblStyleRowBandSize w:val="1"/>
+      <w:tblStyleColBandSize w:val="1"/>
+    </w:tblPr>
+  </w:style>
+  <w:style w:type="table" w:styleId="Table40">
+    <w:basedOn w:val="TableNormal"/>
+    <w:tblPr>
+      <w:tblStyleRowBandSize w:val="1"/>
+      <w:tblStyleColBandSize w:val="1"/>
+    </w:tblPr>
+  </w:style>
+  <w:style w:type="table" w:styleId="Table41">
+    <w:basedOn w:val="TableNormal"/>
+    <w:tblPr>
+      <w:tblStyleRowBandSize w:val="1"/>
+      <w:tblStyleColBandSize w:val="1"/>
+    </w:tblPr>
+  </w:style>
+  <w:style w:type="table" w:styleId="Table42">
+    <w:basedOn w:val="TableNormal"/>
+    <w:tblPr>
+      <w:tblStyleRowBandSize w:val="1"/>
+      <w:tblStyleColBandSize w:val="1"/>
+    </w:tblPr>
+  </w:style>
+  <w:style w:type="table" w:styleId="Table43">
+    <w:basedOn w:val="TableNormal"/>
+    <w:tblPr>
+      <w:tblStyleRowBandSize w:val="1"/>
+      <w:tblStyleColBandSize w:val="1"/>
+    </w:tblPr>
+  </w:style>
 </w:styles>
 </file>
 

</xml_diff>

<commit_message>
actualización documento daily meeting
</commit_message>
<xml_diff>
--- a/Fase 2/Evidencias Proyecto/Evidencias de documentación/Ev. Daily Meeting.docx
+++ b/Fase 2/Evidencias Proyecto/Evidencias de documentación/Ev. Daily Meeting.docx
@@ -10547,6 +10547,7 @@
               <w:rPr>
                 <w:rtl w:val="0"/>
               </w:rPr>
+              <w:t xml:space="preserve">No Aplica</w:t>
             </w:r>
           </w:p>
         </w:tc>
@@ -10603,6 +10604,7 @@
               <w:rPr>
                 <w:rtl w:val="0"/>
               </w:rPr>
+              <w:t xml:space="preserve">No Aplica</w:t>
             </w:r>
           </w:p>
         </w:tc>
@@ -10818,6 +10820,7 @@
               <w:rPr>
                 <w:rtl w:val="0"/>
               </w:rPr>
+              <w:t xml:space="preserve">No Aplica</w:t>
             </w:r>
           </w:p>
         </w:tc>
@@ -10874,6 +10877,7 @@
               <w:rPr>
                 <w:rtl w:val="0"/>
               </w:rPr>
+              <w:t xml:space="preserve">No Aplica</w:t>
             </w:r>
           </w:p>
         </w:tc>
@@ -11089,6 +11093,7 @@
               <w:rPr>
                 <w:rtl w:val="0"/>
               </w:rPr>
+              <w:t xml:space="preserve">No Aplica</w:t>
             </w:r>
           </w:p>
         </w:tc>
@@ -11145,6 +11150,7 @@
               <w:rPr>
                 <w:rtl w:val="0"/>
               </w:rPr>
+              <w:t xml:space="preserve">No Aplica</w:t>
             </w:r>
           </w:p>
         </w:tc>
@@ -11360,6 +11366,7 @@
               <w:rPr>
                 <w:rtl w:val="0"/>
               </w:rPr>
+              <w:t xml:space="preserve">No Aplica</w:t>
             </w:r>
           </w:p>
         </w:tc>
@@ -11416,6 +11423,7 @@
               <w:rPr>
                 <w:rtl w:val="0"/>
               </w:rPr>
+              <w:t xml:space="preserve">Implementación de trazabilidad de trabajos por usuario.</w:t>
             </w:r>
           </w:p>
         </w:tc>
@@ -11478,6 +11486,1934 @@
         </w:tc>
       </w:tr>
     </w:tbl>
+    <w:p>
+      <w:pPr>
+        <w:rPr/>
+      </w:pPr>
+      <w:r>
+        <w:rPr>
+          <w:rtl w:val="0"/>
+        </w:rPr>
+      </w:r>
+    </w:p>
+    <w:tbl>
+      <w:tblPr>
+        <w:tblStyle w:val="Table42"/>
+        <w:tblW w:w="8503.937007874018" w:type="dxa"/>
+        <w:jc w:val="center"/>
+        <w:tblBorders>
+          <w:top w:color="000000" w:space="0" w:sz="8" w:val="single"/>
+          <w:left w:color="000000" w:space="0" w:sz="8" w:val="single"/>
+          <w:bottom w:color="000000" w:space="0" w:sz="8" w:val="single"/>
+          <w:right w:color="000000" w:space="0" w:sz="8" w:val="single"/>
+          <w:insideH w:color="000000" w:space="0" w:sz="8" w:val="single"/>
+          <w:insideV w:color="000000" w:space="0" w:sz="8" w:val="single"/>
+        </w:tblBorders>
+        <w:tblLayout w:type="fixed"/>
+        <w:tblLook w:val="0600"/>
+      </w:tblPr>
+      <w:tblGrid>
+        <w:gridCol w:w="2267.716535433071"/>
+        <w:gridCol w:w="6236.220472440946"/>
+        <w:tblGridChange w:id="0">
+          <w:tblGrid>
+            <w:gridCol w:w="2267.716535433071"/>
+            <w:gridCol w:w="6236.220472440946"/>
+          </w:tblGrid>
+        </w:tblGridChange>
+      </w:tblGrid>
+      <w:tr>
+        <w:trPr>
+          <w:cantSplit w:val="1"/>
+          <w:tblHeader w:val="0"/>
+        </w:trPr>
+        <w:tc>
+          <w:tcPr>
+            <w:shd w:fill="cfe2f3" w:val="clear"/>
+            <w:tcMar>
+              <w:top w:w="28.34645669291339" w:type="dxa"/>
+              <w:left w:w="28.34645669291339" w:type="dxa"/>
+              <w:bottom w:w="28.34645669291339" w:type="dxa"/>
+              <w:right w:w="28.34645669291339" w:type="dxa"/>
+            </w:tcMar>
+          </w:tcPr>
+          <w:p>
+            <w:pPr>
+              <w:widowControl w:val="0"/>
+              <w:spacing w:line="240" w:lineRule="auto"/>
+              <w:jc w:val="center"/>
+              <w:rPr>
+                <w:b w:val="1"/>
+                <w:bCs w:val="1"/>
+              </w:rPr>
+            </w:pPr>
+            <w:r>
+              <w:rPr>
+                <w:b w:val="1"/>
+                <w:bCs w:val="1"/>
+                <w:rtl w:val="0"/>
+              </w:rPr>
+              <w:t xml:space="preserve">Fecha: 19-10-2026</w:t>
+            </w:r>
+          </w:p>
+        </w:tc>
+        <w:tc>
+          <w:tcPr>
+            <w:shd w:fill="cfe2f3" w:val="clear"/>
+            <w:tcMar>
+              <w:top w:w="28.34645669291339" w:type="dxa"/>
+              <w:left w:w="28.34645669291339" w:type="dxa"/>
+              <w:bottom w:w="28.34645669291339" w:type="dxa"/>
+              <w:right w:w="28.34645669291339" w:type="dxa"/>
+            </w:tcMar>
+          </w:tcPr>
+          <w:p>
+            <w:pPr>
+              <w:widowControl w:val="0"/>
+              <w:spacing w:line="240" w:lineRule="auto"/>
+              <w:rPr>
+                <w:b w:val="1"/>
+                <w:bCs w:val="1"/>
+              </w:rPr>
+            </w:pPr>
+            <w:r>
+              <w:rPr>
+                <w:b w:val="1"/>
+                <w:bCs w:val="1"/>
+                <w:rtl w:val="0"/>
+              </w:rPr>
+              <w:t xml:space="preserve">Sprint: 2</w:t>
+            </w:r>
+          </w:p>
+        </w:tc>
+      </w:tr>
+      <w:tr>
+        <w:trPr>
+          <w:cantSplit w:val="1"/>
+          <w:tblHeader w:val="0"/>
+        </w:trPr>
+        <w:tc>
+          <w:tcPr>
+            <w:tcMar>
+              <w:top w:w="28.34645669291339" w:type="dxa"/>
+              <w:left w:w="28.34645669291339" w:type="dxa"/>
+              <w:bottom w:w="28.34645669291339" w:type="dxa"/>
+              <w:right w:w="28.34645669291339" w:type="dxa"/>
+            </w:tcMar>
+          </w:tcPr>
+          <w:p>
+            <w:pPr>
+              <w:widowControl w:val="0"/>
+              <w:spacing w:line="240" w:lineRule="auto"/>
+              <w:rPr>
+                <w:b w:val="1"/>
+                <w:bCs w:val="1"/>
+              </w:rPr>
+            </w:pPr>
+            <w:r>
+              <w:rPr>
+                <w:b w:val="1"/>
+                <w:bCs w:val="1"/>
+                <w:rtl w:val="0"/>
+              </w:rPr>
+              <w:t xml:space="preserve">Que se hizo</w:t>
+            </w:r>
+          </w:p>
+        </w:tc>
+        <w:tc>
+          <w:tcPr>
+            <w:tcMar>
+              <w:top w:w="28.34645669291339" w:type="dxa"/>
+              <w:left w:w="28.34645669291339" w:type="dxa"/>
+              <w:bottom w:w="28.34645669291339" w:type="dxa"/>
+              <w:right w:w="28.34645669291339" w:type="dxa"/>
+            </w:tcMar>
+          </w:tcPr>
+          <w:p>
+            <w:pPr>
+              <w:widowControl w:val="0"/>
+              <w:spacing w:line="240" w:lineRule="auto"/>
+              <w:rPr/>
+            </w:pPr>
+            <w:r>
+              <w:rPr>
+                <w:rtl w:val="0"/>
+              </w:rPr>
+              <w:t xml:space="preserve">No Aplica</w:t>
+            </w:r>
+          </w:p>
+        </w:tc>
+      </w:tr>
+      <w:tr>
+        <w:trPr>
+          <w:cantSplit w:val="1"/>
+          <w:tblHeader w:val="0"/>
+        </w:trPr>
+        <w:tc>
+          <w:tcPr>
+            <w:tcMar>
+              <w:top w:w="28.34645669291339" w:type="dxa"/>
+              <w:left w:w="28.34645669291339" w:type="dxa"/>
+              <w:bottom w:w="28.34645669291339" w:type="dxa"/>
+              <w:right w:w="28.34645669291339" w:type="dxa"/>
+            </w:tcMar>
+          </w:tcPr>
+          <w:p>
+            <w:pPr>
+              <w:widowControl w:val="0"/>
+              <w:spacing w:line="240" w:lineRule="auto"/>
+              <w:rPr>
+                <w:b w:val="1"/>
+                <w:bCs w:val="1"/>
+              </w:rPr>
+            </w:pPr>
+            <w:r>
+              <w:rPr>
+                <w:b w:val="1"/>
+                <w:bCs w:val="1"/>
+                <w:rtl w:val="0"/>
+              </w:rPr>
+              <w:t xml:space="preserve">Que se hará</w:t>
+            </w:r>
+          </w:p>
+        </w:tc>
+        <w:tc>
+          <w:tcPr>
+            <w:tcMar>
+              <w:top w:w="28.34645669291339" w:type="dxa"/>
+              <w:left w:w="28.34645669291339" w:type="dxa"/>
+              <w:bottom w:w="28.34645669291339" w:type="dxa"/>
+              <w:right w:w="28.34645669291339" w:type="dxa"/>
+            </w:tcMar>
+          </w:tcPr>
+          <w:p>
+            <w:pPr>
+              <w:widowControl w:val="0"/>
+              <w:spacing w:line="240" w:lineRule="auto"/>
+              <w:rPr/>
+            </w:pPr>
+            <w:r>
+              <w:rPr>
+                <w:rtl w:val="0"/>
+              </w:rPr>
+              <w:t xml:space="preserve">No Aplica</w:t>
+            </w:r>
+          </w:p>
+        </w:tc>
+      </w:tr>
+      <w:tr>
+        <w:trPr>
+          <w:cantSplit w:val="1"/>
+          <w:tblHeader w:val="0"/>
+        </w:trPr>
+        <w:tc>
+          <w:tcPr>
+            <w:tcMar>
+              <w:top w:w="28.34645669291339" w:type="dxa"/>
+              <w:left w:w="28.34645669291339" w:type="dxa"/>
+              <w:bottom w:w="28.34645669291339" w:type="dxa"/>
+              <w:right w:w="28.34645669291339" w:type="dxa"/>
+            </w:tcMar>
+          </w:tcPr>
+          <w:p>
+            <w:pPr>
+              <w:widowControl w:val="0"/>
+              <w:spacing w:line="240" w:lineRule="auto"/>
+              <w:rPr>
+                <w:b w:val="1"/>
+                <w:bCs w:val="1"/>
+              </w:rPr>
+            </w:pPr>
+            <w:r>
+              <w:rPr>
+                <w:b w:val="1"/>
+                <w:bCs w:val="1"/>
+                <w:rtl w:val="0"/>
+              </w:rPr>
+              <w:t xml:space="preserve">Impedimentos</w:t>
+            </w:r>
+          </w:p>
+        </w:tc>
+        <w:tc>
+          <w:tcPr>
+            <w:tcMar>
+              <w:top w:w="28.34645669291339" w:type="dxa"/>
+              <w:left w:w="28.34645669291339" w:type="dxa"/>
+              <w:bottom w:w="28.34645669291339" w:type="dxa"/>
+              <w:right w:w="28.34645669291339" w:type="dxa"/>
+            </w:tcMar>
+          </w:tcPr>
+          <w:p>
+            <w:pPr>
+              <w:widowControl w:val="0"/>
+              <w:spacing w:line="240" w:lineRule="auto"/>
+              <w:rPr/>
+            </w:pPr>
+            <w:r>
+              <w:rPr>
+                <w:rtl w:val="0"/>
+              </w:rPr>
+              <w:t xml:space="preserve">No Aplica</w:t>
+            </w:r>
+          </w:p>
+        </w:tc>
+      </w:tr>
+    </w:tbl>
+    <w:p>
+      <w:pPr>
+        <w:rPr/>
+      </w:pPr>
+      <w:r>
+        <w:rPr>
+          <w:rtl w:val="0"/>
+        </w:rPr>
+      </w:r>
+    </w:p>
+    <w:tbl>
+      <w:tblPr>
+        <w:tblStyle w:val="Table43"/>
+        <w:tblW w:w="8503.937007874018" w:type="dxa"/>
+        <w:jc w:val="center"/>
+        <w:tblBorders>
+          <w:top w:color="000000" w:space="0" w:sz="8" w:val="single"/>
+          <w:left w:color="000000" w:space="0" w:sz="8" w:val="single"/>
+          <w:bottom w:color="000000" w:space="0" w:sz="8" w:val="single"/>
+          <w:right w:color="000000" w:space="0" w:sz="8" w:val="single"/>
+          <w:insideH w:color="000000" w:space="0" w:sz="8" w:val="single"/>
+          <w:insideV w:color="000000" w:space="0" w:sz="8" w:val="single"/>
+        </w:tblBorders>
+        <w:tblLayout w:type="fixed"/>
+        <w:tblLook w:val="0600"/>
+      </w:tblPr>
+      <w:tblGrid>
+        <w:gridCol w:w="2267.716535433071"/>
+        <w:gridCol w:w="6236.220472440946"/>
+        <w:tblGridChange w:id="0">
+          <w:tblGrid>
+            <w:gridCol w:w="2267.716535433071"/>
+            <w:gridCol w:w="6236.220472440946"/>
+          </w:tblGrid>
+        </w:tblGridChange>
+      </w:tblGrid>
+      <w:tr>
+        <w:trPr>
+          <w:cantSplit w:val="1"/>
+          <w:tblHeader w:val="0"/>
+        </w:trPr>
+        <w:tc>
+          <w:tcPr>
+            <w:shd w:fill="cfe2f3" w:val="clear"/>
+            <w:tcMar>
+              <w:top w:w="28.34645669291339" w:type="dxa"/>
+              <w:left w:w="28.34645669291339" w:type="dxa"/>
+              <w:bottom w:w="28.34645669291339" w:type="dxa"/>
+              <w:right w:w="28.34645669291339" w:type="dxa"/>
+            </w:tcMar>
+          </w:tcPr>
+          <w:p>
+            <w:pPr>
+              <w:widowControl w:val="0"/>
+              <w:spacing w:line="240" w:lineRule="auto"/>
+              <w:jc w:val="center"/>
+              <w:rPr>
+                <w:b w:val="1"/>
+                <w:bCs w:val="1"/>
+              </w:rPr>
+            </w:pPr>
+            <w:r>
+              <w:rPr>
+                <w:b w:val="1"/>
+                <w:bCs w:val="1"/>
+                <w:rtl w:val="0"/>
+              </w:rPr>
+              <w:t xml:space="preserve">Fecha: 20-10-2026</w:t>
+            </w:r>
+          </w:p>
+        </w:tc>
+        <w:tc>
+          <w:tcPr>
+            <w:shd w:fill="cfe2f3" w:val="clear"/>
+            <w:tcMar>
+              <w:top w:w="28.34645669291339" w:type="dxa"/>
+              <w:left w:w="28.34645669291339" w:type="dxa"/>
+              <w:bottom w:w="28.34645669291339" w:type="dxa"/>
+              <w:right w:w="28.34645669291339" w:type="dxa"/>
+            </w:tcMar>
+          </w:tcPr>
+          <w:p>
+            <w:pPr>
+              <w:widowControl w:val="0"/>
+              <w:spacing w:line="240" w:lineRule="auto"/>
+              <w:rPr>
+                <w:b w:val="1"/>
+                <w:bCs w:val="1"/>
+              </w:rPr>
+            </w:pPr>
+            <w:r>
+              <w:rPr>
+                <w:b w:val="1"/>
+                <w:bCs w:val="1"/>
+                <w:rtl w:val="0"/>
+              </w:rPr>
+              <w:t xml:space="preserve">Sprint: 2</w:t>
+            </w:r>
+          </w:p>
+        </w:tc>
+      </w:tr>
+      <w:tr>
+        <w:trPr>
+          <w:cantSplit w:val="1"/>
+          <w:tblHeader w:val="0"/>
+        </w:trPr>
+        <w:tc>
+          <w:tcPr>
+            <w:tcMar>
+              <w:top w:w="28.34645669291339" w:type="dxa"/>
+              <w:left w:w="28.34645669291339" w:type="dxa"/>
+              <w:bottom w:w="28.34645669291339" w:type="dxa"/>
+              <w:right w:w="28.34645669291339" w:type="dxa"/>
+            </w:tcMar>
+          </w:tcPr>
+          <w:p>
+            <w:pPr>
+              <w:widowControl w:val="0"/>
+              <w:spacing w:line="240" w:lineRule="auto"/>
+              <w:rPr>
+                <w:b w:val="1"/>
+                <w:bCs w:val="1"/>
+              </w:rPr>
+            </w:pPr>
+            <w:r>
+              <w:rPr>
+                <w:b w:val="1"/>
+                <w:bCs w:val="1"/>
+                <w:rtl w:val="0"/>
+              </w:rPr>
+              <w:t xml:space="preserve">Que se hizo</w:t>
+            </w:r>
+          </w:p>
+        </w:tc>
+        <w:tc>
+          <w:tcPr>
+            <w:tcMar>
+              <w:top w:w="28.34645669291339" w:type="dxa"/>
+              <w:left w:w="28.34645669291339" w:type="dxa"/>
+              <w:bottom w:w="28.34645669291339" w:type="dxa"/>
+              <w:right w:w="28.34645669291339" w:type="dxa"/>
+            </w:tcMar>
+          </w:tcPr>
+          <w:p>
+            <w:pPr>
+              <w:widowControl w:val="0"/>
+              <w:spacing w:line="240" w:lineRule="auto"/>
+              <w:rPr/>
+            </w:pPr>
+            <w:r>
+              <w:rPr>
+                <w:rtl w:val="0"/>
+              </w:rPr>
+              <w:t xml:space="preserve">No Aplica</w:t>
+            </w:r>
+          </w:p>
+        </w:tc>
+      </w:tr>
+      <w:tr>
+        <w:trPr>
+          <w:cantSplit w:val="1"/>
+          <w:tblHeader w:val="0"/>
+        </w:trPr>
+        <w:tc>
+          <w:tcPr>
+            <w:tcMar>
+              <w:top w:w="28.34645669291339" w:type="dxa"/>
+              <w:left w:w="28.34645669291339" w:type="dxa"/>
+              <w:bottom w:w="28.34645669291339" w:type="dxa"/>
+              <w:right w:w="28.34645669291339" w:type="dxa"/>
+            </w:tcMar>
+          </w:tcPr>
+          <w:p>
+            <w:pPr>
+              <w:widowControl w:val="0"/>
+              <w:spacing w:line="240" w:lineRule="auto"/>
+              <w:rPr>
+                <w:b w:val="1"/>
+                <w:bCs w:val="1"/>
+              </w:rPr>
+            </w:pPr>
+            <w:r>
+              <w:rPr>
+                <w:b w:val="1"/>
+                <w:bCs w:val="1"/>
+                <w:rtl w:val="0"/>
+              </w:rPr>
+              <w:t xml:space="preserve">Que se hará</w:t>
+            </w:r>
+          </w:p>
+        </w:tc>
+        <w:tc>
+          <w:tcPr>
+            <w:tcMar>
+              <w:top w:w="28.34645669291339" w:type="dxa"/>
+              <w:left w:w="28.34645669291339" w:type="dxa"/>
+              <w:bottom w:w="28.34645669291339" w:type="dxa"/>
+              <w:right w:w="28.34645669291339" w:type="dxa"/>
+            </w:tcMar>
+          </w:tcPr>
+          <w:p>
+            <w:pPr>
+              <w:widowControl w:val="0"/>
+              <w:spacing w:line="240" w:lineRule="auto"/>
+              <w:rPr/>
+            </w:pPr>
+            <w:r>
+              <w:rPr>
+                <w:rtl w:val="0"/>
+              </w:rPr>
+              <w:t xml:space="preserve">Organización reunión, discusión sobre implementación de servicios de google calendar y gemini API, arreglos finales de documentos</w:t>
+            </w:r>
+          </w:p>
+        </w:tc>
+      </w:tr>
+      <w:tr>
+        <w:trPr>
+          <w:cantSplit w:val="1"/>
+          <w:tblHeader w:val="0"/>
+        </w:trPr>
+        <w:tc>
+          <w:tcPr>
+            <w:tcMar>
+              <w:top w:w="28.34645669291339" w:type="dxa"/>
+              <w:left w:w="28.34645669291339" w:type="dxa"/>
+              <w:bottom w:w="28.34645669291339" w:type="dxa"/>
+              <w:right w:w="28.34645669291339" w:type="dxa"/>
+            </w:tcMar>
+          </w:tcPr>
+          <w:p>
+            <w:pPr>
+              <w:widowControl w:val="0"/>
+              <w:spacing w:line="240" w:lineRule="auto"/>
+              <w:rPr>
+                <w:b w:val="1"/>
+                <w:bCs w:val="1"/>
+              </w:rPr>
+            </w:pPr>
+            <w:r>
+              <w:rPr>
+                <w:b w:val="1"/>
+                <w:bCs w:val="1"/>
+                <w:rtl w:val="0"/>
+              </w:rPr>
+              <w:t xml:space="preserve">Impedimentos</w:t>
+            </w:r>
+          </w:p>
+        </w:tc>
+        <w:tc>
+          <w:tcPr>
+            <w:tcMar>
+              <w:top w:w="28.34645669291339" w:type="dxa"/>
+              <w:left w:w="28.34645669291339" w:type="dxa"/>
+              <w:bottom w:w="28.34645669291339" w:type="dxa"/>
+              <w:right w:w="28.34645669291339" w:type="dxa"/>
+            </w:tcMar>
+          </w:tcPr>
+          <w:p>
+            <w:pPr>
+              <w:widowControl w:val="0"/>
+              <w:spacing w:line="240" w:lineRule="auto"/>
+              <w:rPr/>
+            </w:pPr>
+            <w:r>
+              <w:rPr>
+                <w:rtl w:val="0"/>
+              </w:rPr>
+              <w:t xml:space="preserve">No Aplica</w:t>
+            </w:r>
+          </w:p>
+        </w:tc>
+      </w:tr>
+    </w:tbl>
+    <w:p>
+      <w:pPr>
+        <w:rPr/>
+      </w:pPr>
+      <w:r>
+        <w:br w:type="page"/>
+      </w:r>
+      <w:r>
+        <w:rPr>
+          <w:rtl w:val="0"/>
+        </w:rPr>
+      </w:r>
+    </w:p>
+    <w:p>
+      <w:pPr>
+        <w:rPr/>
+      </w:pPr>
+      <w:r>
+        <w:rPr>
+          <w:rtl w:val="0"/>
+        </w:rPr>
+      </w:r>
+    </w:p>
+    <w:tbl>
+      <w:tblPr>
+        <w:tblStyle w:val="Table44"/>
+        <w:tblW w:w="8503.937007874018" w:type="dxa"/>
+        <w:jc w:val="center"/>
+        <w:tblBorders>
+          <w:top w:color="000000" w:space="0" w:sz="8" w:val="single"/>
+          <w:left w:color="000000" w:space="0" w:sz="8" w:val="single"/>
+          <w:bottom w:color="000000" w:space="0" w:sz="8" w:val="single"/>
+          <w:right w:color="000000" w:space="0" w:sz="8" w:val="single"/>
+          <w:insideH w:color="000000" w:space="0" w:sz="8" w:val="single"/>
+          <w:insideV w:color="000000" w:space="0" w:sz="8" w:val="single"/>
+        </w:tblBorders>
+        <w:tblLayout w:type="fixed"/>
+        <w:tblLook w:val="0600"/>
+      </w:tblPr>
+      <w:tblGrid>
+        <w:gridCol w:w="2267.716535433071"/>
+        <w:gridCol w:w="6236.220472440946"/>
+        <w:tblGridChange w:id="0">
+          <w:tblGrid>
+            <w:gridCol w:w="2267.716535433071"/>
+            <w:gridCol w:w="6236.220472440946"/>
+          </w:tblGrid>
+        </w:tblGridChange>
+      </w:tblGrid>
+      <w:tr>
+        <w:trPr>
+          <w:cantSplit w:val="1"/>
+          <w:tblHeader w:val="0"/>
+        </w:trPr>
+        <w:tc>
+          <w:tcPr>
+            <w:shd w:fill="cfe2f3" w:val="clear"/>
+            <w:tcMar>
+              <w:top w:w="28.34645669291339" w:type="dxa"/>
+              <w:left w:w="28.34645669291339" w:type="dxa"/>
+              <w:bottom w:w="28.34645669291339" w:type="dxa"/>
+              <w:right w:w="28.34645669291339" w:type="dxa"/>
+            </w:tcMar>
+          </w:tcPr>
+          <w:p>
+            <w:pPr>
+              <w:widowControl w:val="0"/>
+              <w:spacing w:line="240" w:lineRule="auto"/>
+              <w:jc w:val="center"/>
+              <w:rPr>
+                <w:b w:val="1"/>
+                <w:bCs w:val="1"/>
+              </w:rPr>
+            </w:pPr>
+            <w:r>
+              <w:rPr>
+                <w:b w:val="1"/>
+                <w:bCs w:val="1"/>
+                <w:rtl w:val="0"/>
+              </w:rPr>
+              <w:t xml:space="preserve">Fecha: 21-10-2026</w:t>
+            </w:r>
+          </w:p>
+        </w:tc>
+        <w:tc>
+          <w:tcPr>
+            <w:shd w:fill="cfe2f3" w:val="clear"/>
+            <w:tcMar>
+              <w:top w:w="28.34645669291339" w:type="dxa"/>
+              <w:left w:w="28.34645669291339" w:type="dxa"/>
+              <w:bottom w:w="28.34645669291339" w:type="dxa"/>
+              <w:right w:w="28.34645669291339" w:type="dxa"/>
+            </w:tcMar>
+          </w:tcPr>
+          <w:p>
+            <w:pPr>
+              <w:widowControl w:val="0"/>
+              <w:spacing w:line="240" w:lineRule="auto"/>
+              <w:rPr>
+                <w:b w:val="1"/>
+                <w:bCs w:val="1"/>
+              </w:rPr>
+            </w:pPr>
+            <w:r>
+              <w:rPr>
+                <w:b w:val="1"/>
+                <w:bCs w:val="1"/>
+                <w:rtl w:val="0"/>
+              </w:rPr>
+              <w:t xml:space="preserve">Sprint: 2</w:t>
+            </w:r>
+          </w:p>
+        </w:tc>
+      </w:tr>
+      <w:tr>
+        <w:trPr>
+          <w:cantSplit w:val="1"/>
+          <w:tblHeader w:val="0"/>
+        </w:trPr>
+        <w:tc>
+          <w:tcPr>
+            <w:tcMar>
+              <w:top w:w="28.34645669291339" w:type="dxa"/>
+              <w:left w:w="28.34645669291339" w:type="dxa"/>
+              <w:bottom w:w="28.34645669291339" w:type="dxa"/>
+              <w:right w:w="28.34645669291339" w:type="dxa"/>
+            </w:tcMar>
+          </w:tcPr>
+          <w:p>
+            <w:pPr>
+              <w:widowControl w:val="0"/>
+              <w:spacing w:line="240" w:lineRule="auto"/>
+              <w:rPr>
+                <w:b w:val="1"/>
+                <w:bCs w:val="1"/>
+              </w:rPr>
+            </w:pPr>
+            <w:r>
+              <w:rPr>
+                <w:b w:val="1"/>
+                <w:bCs w:val="1"/>
+                <w:rtl w:val="0"/>
+              </w:rPr>
+              <w:t xml:space="preserve">Que se hizo</w:t>
+            </w:r>
+          </w:p>
+        </w:tc>
+        <w:tc>
+          <w:tcPr>
+            <w:tcMar>
+              <w:top w:w="28.34645669291339" w:type="dxa"/>
+              <w:left w:w="28.34645669291339" w:type="dxa"/>
+              <w:bottom w:w="28.34645669291339" w:type="dxa"/>
+              <w:right w:w="28.34645669291339" w:type="dxa"/>
+            </w:tcMar>
+          </w:tcPr>
+          <w:p>
+            <w:pPr>
+              <w:widowControl w:val="0"/>
+              <w:spacing w:line="240" w:lineRule="auto"/>
+              <w:rPr/>
+            </w:pPr>
+            <w:r>
+              <w:rPr>
+                <w:rtl w:val="0"/>
+              </w:rPr>
+              <w:t xml:space="preserve">No Aplica</w:t>
+            </w:r>
+          </w:p>
+        </w:tc>
+      </w:tr>
+      <w:tr>
+        <w:trPr>
+          <w:cantSplit w:val="1"/>
+          <w:tblHeader w:val="0"/>
+        </w:trPr>
+        <w:tc>
+          <w:tcPr>
+            <w:tcMar>
+              <w:top w:w="28.34645669291339" w:type="dxa"/>
+              <w:left w:w="28.34645669291339" w:type="dxa"/>
+              <w:bottom w:w="28.34645669291339" w:type="dxa"/>
+              <w:right w:w="28.34645669291339" w:type="dxa"/>
+            </w:tcMar>
+          </w:tcPr>
+          <w:p>
+            <w:pPr>
+              <w:widowControl w:val="0"/>
+              <w:spacing w:line="240" w:lineRule="auto"/>
+              <w:rPr>
+                <w:b w:val="1"/>
+                <w:bCs w:val="1"/>
+              </w:rPr>
+            </w:pPr>
+            <w:r>
+              <w:rPr>
+                <w:b w:val="1"/>
+                <w:bCs w:val="1"/>
+                <w:rtl w:val="0"/>
+              </w:rPr>
+              <w:t xml:space="preserve">Que se hará</w:t>
+            </w:r>
+          </w:p>
+        </w:tc>
+        <w:tc>
+          <w:tcPr>
+            <w:tcMar>
+              <w:top w:w="28.34645669291339" w:type="dxa"/>
+              <w:left w:w="28.34645669291339" w:type="dxa"/>
+              <w:bottom w:w="28.34645669291339" w:type="dxa"/>
+              <w:right w:w="28.34645669291339" w:type="dxa"/>
+            </w:tcMar>
+          </w:tcPr>
+          <w:p>
+            <w:pPr>
+              <w:widowControl w:val="0"/>
+              <w:spacing w:line="240" w:lineRule="auto"/>
+              <w:rPr/>
+            </w:pPr>
+            <w:r>
+              <w:rPr>
+                <w:rtl w:val="0"/>
+              </w:rPr>
+              <w:t xml:space="preserve">Finalización documentación</w:t>
+            </w:r>
+          </w:p>
+        </w:tc>
+      </w:tr>
+      <w:tr>
+        <w:trPr>
+          <w:cantSplit w:val="1"/>
+          <w:tblHeader w:val="0"/>
+        </w:trPr>
+        <w:tc>
+          <w:tcPr>
+            <w:tcMar>
+              <w:top w:w="28.34645669291339" w:type="dxa"/>
+              <w:left w:w="28.34645669291339" w:type="dxa"/>
+              <w:bottom w:w="28.34645669291339" w:type="dxa"/>
+              <w:right w:w="28.34645669291339" w:type="dxa"/>
+            </w:tcMar>
+          </w:tcPr>
+          <w:p>
+            <w:pPr>
+              <w:widowControl w:val="0"/>
+              <w:spacing w:line="240" w:lineRule="auto"/>
+              <w:rPr>
+                <w:b w:val="1"/>
+                <w:bCs w:val="1"/>
+              </w:rPr>
+            </w:pPr>
+            <w:r>
+              <w:rPr>
+                <w:b w:val="1"/>
+                <w:bCs w:val="1"/>
+                <w:rtl w:val="0"/>
+              </w:rPr>
+              <w:t xml:space="preserve">Impedimentos</w:t>
+            </w:r>
+          </w:p>
+        </w:tc>
+        <w:tc>
+          <w:tcPr>
+            <w:tcMar>
+              <w:top w:w="28.34645669291339" w:type="dxa"/>
+              <w:left w:w="28.34645669291339" w:type="dxa"/>
+              <w:bottom w:w="28.34645669291339" w:type="dxa"/>
+              <w:right w:w="28.34645669291339" w:type="dxa"/>
+            </w:tcMar>
+          </w:tcPr>
+          <w:p>
+            <w:pPr>
+              <w:widowControl w:val="0"/>
+              <w:spacing w:line="240" w:lineRule="auto"/>
+              <w:rPr/>
+            </w:pPr>
+            <w:r>
+              <w:rPr>
+                <w:rtl w:val="0"/>
+              </w:rPr>
+              <w:t xml:space="preserve">No Aplica</w:t>
+            </w:r>
+          </w:p>
+        </w:tc>
+      </w:tr>
+    </w:tbl>
+    <w:p>
+      <w:pPr>
+        <w:rPr/>
+      </w:pPr>
+      <w:r>
+        <w:rPr>
+          <w:rtl w:val="0"/>
+        </w:rPr>
+      </w:r>
+    </w:p>
+    <w:tbl>
+      <w:tblPr>
+        <w:tblStyle w:val="Table45"/>
+        <w:tblW w:w="8503.937007874018" w:type="dxa"/>
+        <w:jc w:val="center"/>
+        <w:tblBorders>
+          <w:top w:color="000000" w:space="0" w:sz="8" w:val="single"/>
+          <w:left w:color="000000" w:space="0" w:sz="8" w:val="single"/>
+          <w:bottom w:color="000000" w:space="0" w:sz="8" w:val="single"/>
+          <w:right w:color="000000" w:space="0" w:sz="8" w:val="single"/>
+          <w:insideH w:color="000000" w:space="0" w:sz="8" w:val="single"/>
+          <w:insideV w:color="000000" w:space="0" w:sz="8" w:val="single"/>
+        </w:tblBorders>
+        <w:tblLayout w:type="fixed"/>
+        <w:tblLook w:val="0600"/>
+      </w:tblPr>
+      <w:tblGrid>
+        <w:gridCol w:w="2267.716535433071"/>
+        <w:gridCol w:w="6236.220472440946"/>
+        <w:tblGridChange w:id="0">
+          <w:tblGrid>
+            <w:gridCol w:w="2267.716535433071"/>
+            <w:gridCol w:w="6236.220472440946"/>
+          </w:tblGrid>
+        </w:tblGridChange>
+      </w:tblGrid>
+      <w:tr>
+        <w:trPr>
+          <w:cantSplit w:val="1"/>
+          <w:tblHeader w:val="0"/>
+        </w:trPr>
+        <w:tc>
+          <w:tcPr>
+            <w:shd w:fill="cfe2f3" w:val="clear"/>
+            <w:tcMar>
+              <w:top w:w="28.34645669291339" w:type="dxa"/>
+              <w:left w:w="28.34645669291339" w:type="dxa"/>
+              <w:bottom w:w="28.34645669291339" w:type="dxa"/>
+              <w:right w:w="28.34645669291339" w:type="dxa"/>
+            </w:tcMar>
+          </w:tcPr>
+          <w:p>
+            <w:pPr>
+              <w:widowControl w:val="0"/>
+              <w:spacing w:line="240" w:lineRule="auto"/>
+              <w:jc w:val="center"/>
+              <w:rPr>
+                <w:b w:val="1"/>
+                <w:bCs w:val="1"/>
+              </w:rPr>
+            </w:pPr>
+            <w:r>
+              <w:rPr>
+                <w:b w:val="1"/>
+                <w:bCs w:val="1"/>
+                <w:rtl w:val="0"/>
+              </w:rPr>
+              <w:t xml:space="preserve">Fecha: 22-10-2026</w:t>
+            </w:r>
+          </w:p>
+        </w:tc>
+        <w:tc>
+          <w:tcPr>
+            <w:shd w:fill="cfe2f3" w:val="clear"/>
+            <w:tcMar>
+              <w:top w:w="28.34645669291339" w:type="dxa"/>
+              <w:left w:w="28.34645669291339" w:type="dxa"/>
+              <w:bottom w:w="28.34645669291339" w:type="dxa"/>
+              <w:right w:w="28.34645669291339" w:type="dxa"/>
+            </w:tcMar>
+          </w:tcPr>
+          <w:p>
+            <w:pPr>
+              <w:widowControl w:val="0"/>
+              <w:spacing w:line="240" w:lineRule="auto"/>
+              <w:rPr>
+                <w:b w:val="1"/>
+                <w:bCs w:val="1"/>
+              </w:rPr>
+            </w:pPr>
+            <w:r>
+              <w:rPr>
+                <w:b w:val="1"/>
+                <w:bCs w:val="1"/>
+                <w:rtl w:val="0"/>
+              </w:rPr>
+              <w:t xml:space="preserve">Sprint: 2</w:t>
+            </w:r>
+          </w:p>
+        </w:tc>
+      </w:tr>
+      <w:tr>
+        <w:trPr>
+          <w:cantSplit w:val="1"/>
+          <w:tblHeader w:val="0"/>
+        </w:trPr>
+        <w:tc>
+          <w:tcPr>
+            <w:tcMar>
+              <w:top w:w="28.34645669291339" w:type="dxa"/>
+              <w:left w:w="28.34645669291339" w:type="dxa"/>
+              <w:bottom w:w="28.34645669291339" w:type="dxa"/>
+              <w:right w:w="28.34645669291339" w:type="dxa"/>
+            </w:tcMar>
+          </w:tcPr>
+          <w:p>
+            <w:pPr>
+              <w:widowControl w:val="0"/>
+              <w:spacing w:line="240" w:lineRule="auto"/>
+              <w:rPr>
+                <w:b w:val="1"/>
+                <w:bCs w:val="1"/>
+              </w:rPr>
+            </w:pPr>
+            <w:r>
+              <w:rPr>
+                <w:b w:val="1"/>
+                <w:bCs w:val="1"/>
+                <w:rtl w:val="0"/>
+              </w:rPr>
+              <w:t xml:space="preserve">Que se hizo</w:t>
+            </w:r>
+          </w:p>
+        </w:tc>
+        <w:tc>
+          <w:tcPr>
+            <w:tcMar>
+              <w:top w:w="28.34645669291339" w:type="dxa"/>
+              <w:left w:w="28.34645669291339" w:type="dxa"/>
+              <w:bottom w:w="28.34645669291339" w:type="dxa"/>
+              <w:right w:w="28.34645669291339" w:type="dxa"/>
+            </w:tcMar>
+          </w:tcPr>
+          <w:p>
+            <w:pPr>
+              <w:widowControl w:val="0"/>
+              <w:spacing w:line="240" w:lineRule="auto"/>
+              <w:rPr/>
+            </w:pPr>
+            <w:r>
+              <w:rPr>
+                <w:rtl w:val="0"/>
+              </w:rPr>
+              <w:t xml:space="preserve">No Aplica</w:t>
+            </w:r>
+          </w:p>
+        </w:tc>
+      </w:tr>
+      <w:tr>
+        <w:trPr>
+          <w:cantSplit w:val="1"/>
+          <w:tblHeader w:val="0"/>
+        </w:trPr>
+        <w:tc>
+          <w:tcPr>
+            <w:tcMar>
+              <w:top w:w="28.34645669291339" w:type="dxa"/>
+              <w:left w:w="28.34645669291339" w:type="dxa"/>
+              <w:bottom w:w="28.34645669291339" w:type="dxa"/>
+              <w:right w:w="28.34645669291339" w:type="dxa"/>
+            </w:tcMar>
+          </w:tcPr>
+          <w:p>
+            <w:pPr>
+              <w:widowControl w:val="0"/>
+              <w:spacing w:line="240" w:lineRule="auto"/>
+              <w:rPr>
+                <w:b w:val="1"/>
+                <w:bCs w:val="1"/>
+              </w:rPr>
+            </w:pPr>
+            <w:r>
+              <w:rPr>
+                <w:b w:val="1"/>
+                <w:bCs w:val="1"/>
+                <w:rtl w:val="0"/>
+              </w:rPr>
+              <w:t xml:space="preserve">Que se hará</w:t>
+            </w:r>
+          </w:p>
+        </w:tc>
+        <w:tc>
+          <w:tcPr>
+            <w:tcMar>
+              <w:top w:w="28.34645669291339" w:type="dxa"/>
+              <w:left w:w="28.34645669291339" w:type="dxa"/>
+              <w:bottom w:w="28.34645669291339" w:type="dxa"/>
+              <w:right w:w="28.34645669291339" w:type="dxa"/>
+            </w:tcMar>
+          </w:tcPr>
+          <w:p>
+            <w:pPr>
+              <w:widowControl w:val="0"/>
+              <w:spacing w:line="240" w:lineRule="auto"/>
+              <w:rPr/>
+            </w:pPr>
+            <w:r>
+              <w:rPr>
+                <w:rtl w:val="0"/>
+              </w:rPr>
+              <w:t xml:space="preserve">Reunión con cliente sobre termino de Sprint 2, mostrar avances del sistema y recibir feedback</w:t>
+            </w:r>
+          </w:p>
+        </w:tc>
+      </w:tr>
+      <w:tr>
+        <w:trPr>
+          <w:cantSplit w:val="1"/>
+          <w:tblHeader w:val="0"/>
+        </w:trPr>
+        <w:tc>
+          <w:tcPr>
+            <w:tcMar>
+              <w:top w:w="28.34645669291339" w:type="dxa"/>
+              <w:left w:w="28.34645669291339" w:type="dxa"/>
+              <w:bottom w:w="28.34645669291339" w:type="dxa"/>
+              <w:right w:w="28.34645669291339" w:type="dxa"/>
+            </w:tcMar>
+          </w:tcPr>
+          <w:p>
+            <w:pPr>
+              <w:widowControl w:val="0"/>
+              <w:spacing w:line="240" w:lineRule="auto"/>
+              <w:rPr>
+                <w:b w:val="1"/>
+                <w:bCs w:val="1"/>
+              </w:rPr>
+            </w:pPr>
+            <w:r>
+              <w:rPr>
+                <w:b w:val="1"/>
+                <w:bCs w:val="1"/>
+                <w:rtl w:val="0"/>
+              </w:rPr>
+              <w:t xml:space="preserve">Impedimentos</w:t>
+            </w:r>
+          </w:p>
+        </w:tc>
+        <w:tc>
+          <w:tcPr>
+            <w:tcMar>
+              <w:top w:w="28.34645669291339" w:type="dxa"/>
+              <w:left w:w="28.34645669291339" w:type="dxa"/>
+              <w:bottom w:w="28.34645669291339" w:type="dxa"/>
+              <w:right w:w="28.34645669291339" w:type="dxa"/>
+            </w:tcMar>
+          </w:tcPr>
+          <w:p>
+            <w:pPr>
+              <w:widowControl w:val="0"/>
+              <w:spacing w:line="240" w:lineRule="auto"/>
+              <w:rPr/>
+            </w:pPr>
+            <w:r>
+              <w:rPr>
+                <w:rtl w:val="0"/>
+              </w:rPr>
+              <w:t xml:space="preserve">No Aplica</w:t>
+            </w:r>
+          </w:p>
+        </w:tc>
+      </w:tr>
+    </w:tbl>
+    <w:p>
+      <w:pPr>
+        <w:rPr/>
+      </w:pPr>
+      <w:r>
+        <w:rPr>
+          <w:rtl w:val="0"/>
+        </w:rPr>
+      </w:r>
+    </w:p>
+    <w:tbl>
+      <w:tblPr>
+        <w:tblStyle w:val="Table46"/>
+        <w:tblW w:w="8503.937007874018" w:type="dxa"/>
+        <w:jc w:val="center"/>
+        <w:tblBorders>
+          <w:top w:color="000000" w:space="0" w:sz="8" w:val="single"/>
+          <w:left w:color="000000" w:space="0" w:sz="8" w:val="single"/>
+          <w:bottom w:color="000000" w:space="0" w:sz="8" w:val="single"/>
+          <w:right w:color="000000" w:space="0" w:sz="8" w:val="single"/>
+          <w:insideH w:color="000000" w:space="0" w:sz="8" w:val="single"/>
+          <w:insideV w:color="000000" w:space="0" w:sz="8" w:val="single"/>
+        </w:tblBorders>
+        <w:tblLayout w:type="fixed"/>
+        <w:tblLook w:val="0600"/>
+      </w:tblPr>
+      <w:tblGrid>
+        <w:gridCol w:w="2267.716535433071"/>
+        <w:gridCol w:w="6236.220472440946"/>
+        <w:tblGridChange w:id="0">
+          <w:tblGrid>
+            <w:gridCol w:w="2267.716535433071"/>
+            <w:gridCol w:w="6236.220472440946"/>
+          </w:tblGrid>
+        </w:tblGridChange>
+      </w:tblGrid>
+      <w:tr>
+        <w:trPr>
+          <w:cantSplit w:val="1"/>
+          <w:tblHeader w:val="0"/>
+        </w:trPr>
+        <w:tc>
+          <w:tcPr>
+            <w:shd w:fill="cfe2f3" w:val="clear"/>
+            <w:tcMar>
+              <w:top w:w="28.34645669291339" w:type="dxa"/>
+              <w:left w:w="28.34645669291339" w:type="dxa"/>
+              <w:bottom w:w="28.34645669291339" w:type="dxa"/>
+              <w:right w:w="28.34645669291339" w:type="dxa"/>
+            </w:tcMar>
+          </w:tcPr>
+          <w:p>
+            <w:pPr>
+              <w:widowControl w:val="0"/>
+              <w:spacing w:line="240" w:lineRule="auto"/>
+              <w:jc w:val="center"/>
+              <w:rPr>
+                <w:b w:val="1"/>
+                <w:bCs w:val="1"/>
+              </w:rPr>
+            </w:pPr>
+            <w:r>
+              <w:rPr>
+                <w:b w:val="1"/>
+                <w:bCs w:val="1"/>
+                <w:rtl w:val="0"/>
+              </w:rPr>
+              <w:t xml:space="preserve">Fecha: 23-10-2026</w:t>
+            </w:r>
+          </w:p>
+        </w:tc>
+        <w:tc>
+          <w:tcPr>
+            <w:shd w:fill="cfe2f3" w:val="clear"/>
+            <w:tcMar>
+              <w:top w:w="28.34645669291339" w:type="dxa"/>
+              <w:left w:w="28.34645669291339" w:type="dxa"/>
+              <w:bottom w:w="28.34645669291339" w:type="dxa"/>
+              <w:right w:w="28.34645669291339" w:type="dxa"/>
+            </w:tcMar>
+          </w:tcPr>
+          <w:p>
+            <w:pPr>
+              <w:widowControl w:val="0"/>
+              <w:spacing w:line="240" w:lineRule="auto"/>
+              <w:rPr>
+                <w:b w:val="1"/>
+                <w:bCs w:val="1"/>
+              </w:rPr>
+            </w:pPr>
+            <w:r>
+              <w:rPr>
+                <w:b w:val="1"/>
+                <w:bCs w:val="1"/>
+                <w:rtl w:val="0"/>
+              </w:rPr>
+              <w:t xml:space="preserve">Sprint: 2</w:t>
+            </w:r>
+          </w:p>
+        </w:tc>
+      </w:tr>
+      <w:tr>
+        <w:trPr>
+          <w:cantSplit w:val="1"/>
+          <w:tblHeader w:val="0"/>
+        </w:trPr>
+        <w:tc>
+          <w:tcPr>
+            <w:tcMar>
+              <w:top w:w="28.34645669291339" w:type="dxa"/>
+              <w:left w:w="28.34645669291339" w:type="dxa"/>
+              <w:bottom w:w="28.34645669291339" w:type="dxa"/>
+              <w:right w:w="28.34645669291339" w:type="dxa"/>
+            </w:tcMar>
+          </w:tcPr>
+          <w:p>
+            <w:pPr>
+              <w:widowControl w:val="0"/>
+              <w:spacing w:line="240" w:lineRule="auto"/>
+              <w:rPr>
+                <w:b w:val="1"/>
+                <w:bCs w:val="1"/>
+              </w:rPr>
+            </w:pPr>
+            <w:r>
+              <w:rPr>
+                <w:b w:val="1"/>
+                <w:bCs w:val="1"/>
+                <w:rtl w:val="0"/>
+              </w:rPr>
+              <w:t xml:space="preserve">Que se hizo</w:t>
+            </w:r>
+          </w:p>
+        </w:tc>
+        <w:tc>
+          <w:tcPr>
+            <w:tcMar>
+              <w:top w:w="28.34645669291339" w:type="dxa"/>
+              <w:left w:w="28.34645669291339" w:type="dxa"/>
+              <w:bottom w:w="28.34645669291339" w:type="dxa"/>
+              <w:right w:w="28.34645669291339" w:type="dxa"/>
+            </w:tcMar>
+          </w:tcPr>
+          <w:p>
+            <w:pPr>
+              <w:widowControl w:val="0"/>
+              <w:spacing w:line="240" w:lineRule="auto"/>
+              <w:rPr/>
+            </w:pPr>
+            <w:r>
+              <w:rPr>
+                <w:rtl w:val="0"/>
+              </w:rPr>
+            </w:r>
+          </w:p>
+        </w:tc>
+      </w:tr>
+      <w:tr>
+        <w:trPr>
+          <w:cantSplit w:val="1"/>
+          <w:tblHeader w:val="0"/>
+        </w:trPr>
+        <w:tc>
+          <w:tcPr>
+            <w:tcMar>
+              <w:top w:w="28.34645669291339" w:type="dxa"/>
+              <w:left w:w="28.34645669291339" w:type="dxa"/>
+              <w:bottom w:w="28.34645669291339" w:type="dxa"/>
+              <w:right w:w="28.34645669291339" w:type="dxa"/>
+            </w:tcMar>
+          </w:tcPr>
+          <w:p>
+            <w:pPr>
+              <w:widowControl w:val="0"/>
+              <w:spacing w:line="240" w:lineRule="auto"/>
+              <w:rPr>
+                <w:b w:val="1"/>
+                <w:bCs w:val="1"/>
+              </w:rPr>
+            </w:pPr>
+            <w:r>
+              <w:rPr>
+                <w:b w:val="1"/>
+                <w:bCs w:val="1"/>
+                <w:rtl w:val="0"/>
+              </w:rPr>
+              <w:t xml:space="preserve">Que se hará</w:t>
+            </w:r>
+          </w:p>
+        </w:tc>
+        <w:tc>
+          <w:tcPr>
+            <w:tcMar>
+              <w:top w:w="28.34645669291339" w:type="dxa"/>
+              <w:left w:w="28.34645669291339" w:type="dxa"/>
+              <w:bottom w:w="28.34645669291339" w:type="dxa"/>
+              <w:right w:w="28.34645669291339" w:type="dxa"/>
+            </w:tcMar>
+          </w:tcPr>
+          <w:p>
+            <w:pPr>
+              <w:widowControl w:val="0"/>
+              <w:spacing w:line="240" w:lineRule="auto"/>
+              <w:rPr/>
+            </w:pPr>
+            <w:r>
+              <w:rPr>
+                <w:rtl w:val="0"/>
+              </w:rPr>
+            </w:r>
+          </w:p>
+        </w:tc>
+      </w:tr>
+      <w:tr>
+        <w:trPr>
+          <w:cantSplit w:val="1"/>
+          <w:tblHeader w:val="0"/>
+        </w:trPr>
+        <w:tc>
+          <w:tcPr>
+            <w:tcMar>
+              <w:top w:w="28.34645669291339" w:type="dxa"/>
+              <w:left w:w="28.34645669291339" w:type="dxa"/>
+              <w:bottom w:w="28.34645669291339" w:type="dxa"/>
+              <w:right w:w="28.34645669291339" w:type="dxa"/>
+            </w:tcMar>
+          </w:tcPr>
+          <w:p>
+            <w:pPr>
+              <w:widowControl w:val="0"/>
+              <w:spacing w:line="240" w:lineRule="auto"/>
+              <w:rPr>
+                <w:b w:val="1"/>
+                <w:bCs w:val="1"/>
+              </w:rPr>
+            </w:pPr>
+            <w:r>
+              <w:rPr>
+                <w:b w:val="1"/>
+                <w:bCs w:val="1"/>
+                <w:rtl w:val="0"/>
+              </w:rPr>
+              <w:t xml:space="preserve">Impedimentos</w:t>
+            </w:r>
+          </w:p>
+        </w:tc>
+        <w:tc>
+          <w:tcPr>
+            <w:tcMar>
+              <w:top w:w="28.34645669291339" w:type="dxa"/>
+              <w:left w:w="28.34645669291339" w:type="dxa"/>
+              <w:bottom w:w="28.34645669291339" w:type="dxa"/>
+              <w:right w:w="28.34645669291339" w:type="dxa"/>
+            </w:tcMar>
+          </w:tcPr>
+          <w:p>
+            <w:pPr>
+              <w:widowControl w:val="0"/>
+              <w:spacing w:line="240" w:lineRule="auto"/>
+              <w:rPr/>
+            </w:pPr>
+            <w:r>
+              <w:rPr>
+                <w:rtl w:val="0"/>
+              </w:rPr>
+              <w:t xml:space="preserve">No Aplica</w:t>
+            </w:r>
+          </w:p>
+        </w:tc>
+      </w:tr>
+    </w:tbl>
+    <w:p>
+      <w:pPr>
+        <w:rPr/>
+      </w:pPr>
+      <w:r>
+        <w:rPr>
+          <w:rtl w:val="0"/>
+        </w:rPr>
+      </w:r>
+    </w:p>
+    <w:tbl>
+      <w:tblPr>
+        <w:tblStyle w:val="Table47"/>
+        <w:tblW w:w="8503.937007874018" w:type="dxa"/>
+        <w:jc w:val="center"/>
+        <w:tblBorders>
+          <w:top w:color="000000" w:space="0" w:sz="8" w:val="single"/>
+          <w:left w:color="000000" w:space="0" w:sz="8" w:val="single"/>
+          <w:bottom w:color="000000" w:space="0" w:sz="8" w:val="single"/>
+          <w:right w:color="000000" w:space="0" w:sz="8" w:val="single"/>
+          <w:insideH w:color="000000" w:space="0" w:sz="8" w:val="single"/>
+          <w:insideV w:color="000000" w:space="0" w:sz="8" w:val="single"/>
+        </w:tblBorders>
+        <w:tblLayout w:type="fixed"/>
+        <w:tblLook w:val="0600"/>
+      </w:tblPr>
+      <w:tblGrid>
+        <w:gridCol w:w="2267.716535433071"/>
+        <w:gridCol w:w="6236.220472440946"/>
+        <w:tblGridChange w:id="0">
+          <w:tblGrid>
+            <w:gridCol w:w="2267.716535433071"/>
+            <w:gridCol w:w="6236.220472440946"/>
+          </w:tblGrid>
+        </w:tblGridChange>
+      </w:tblGrid>
+      <w:tr>
+        <w:trPr>
+          <w:cantSplit w:val="1"/>
+          <w:tblHeader w:val="0"/>
+        </w:trPr>
+        <w:tc>
+          <w:tcPr>
+            <w:shd w:fill="cfe2f3" w:val="clear"/>
+            <w:tcMar>
+              <w:top w:w="28.34645669291339" w:type="dxa"/>
+              <w:left w:w="28.34645669291339" w:type="dxa"/>
+              <w:bottom w:w="28.34645669291339" w:type="dxa"/>
+              <w:right w:w="28.34645669291339" w:type="dxa"/>
+            </w:tcMar>
+          </w:tcPr>
+          <w:p>
+            <w:pPr>
+              <w:widowControl w:val="0"/>
+              <w:spacing w:line="240" w:lineRule="auto"/>
+              <w:jc w:val="center"/>
+              <w:rPr>
+                <w:b w:val="1"/>
+                <w:bCs w:val="1"/>
+              </w:rPr>
+            </w:pPr>
+            <w:r>
+              <w:rPr>
+                <w:b w:val="1"/>
+                <w:bCs w:val="1"/>
+                <w:rtl w:val="0"/>
+              </w:rPr>
+              <w:t xml:space="preserve">Fecha: 24-10-2026</w:t>
+            </w:r>
+          </w:p>
+        </w:tc>
+        <w:tc>
+          <w:tcPr>
+            <w:shd w:fill="cfe2f3" w:val="clear"/>
+            <w:tcMar>
+              <w:top w:w="28.34645669291339" w:type="dxa"/>
+              <w:left w:w="28.34645669291339" w:type="dxa"/>
+              <w:bottom w:w="28.34645669291339" w:type="dxa"/>
+              <w:right w:w="28.34645669291339" w:type="dxa"/>
+            </w:tcMar>
+          </w:tcPr>
+          <w:p>
+            <w:pPr>
+              <w:widowControl w:val="0"/>
+              <w:spacing w:line="240" w:lineRule="auto"/>
+              <w:rPr>
+                <w:b w:val="1"/>
+                <w:bCs w:val="1"/>
+              </w:rPr>
+            </w:pPr>
+            <w:r>
+              <w:rPr>
+                <w:b w:val="1"/>
+                <w:bCs w:val="1"/>
+                <w:rtl w:val="0"/>
+              </w:rPr>
+              <w:t xml:space="preserve">Sprint: 2</w:t>
+            </w:r>
+          </w:p>
+        </w:tc>
+      </w:tr>
+      <w:tr>
+        <w:trPr>
+          <w:cantSplit w:val="1"/>
+          <w:tblHeader w:val="0"/>
+        </w:trPr>
+        <w:tc>
+          <w:tcPr>
+            <w:tcMar>
+              <w:top w:w="28.34645669291339" w:type="dxa"/>
+              <w:left w:w="28.34645669291339" w:type="dxa"/>
+              <w:bottom w:w="28.34645669291339" w:type="dxa"/>
+              <w:right w:w="28.34645669291339" w:type="dxa"/>
+            </w:tcMar>
+          </w:tcPr>
+          <w:p>
+            <w:pPr>
+              <w:widowControl w:val="0"/>
+              <w:spacing w:line="240" w:lineRule="auto"/>
+              <w:rPr>
+                <w:b w:val="1"/>
+                <w:bCs w:val="1"/>
+              </w:rPr>
+            </w:pPr>
+            <w:r>
+              <w:rPr>
+                <w:b w:val="1"/>
+                <w:bCs w:val="1"/>
+                <w:rtl w:val="0"/>
+              </w:rPr>
+              <w:t xml:space="preserve">Que se hizo</w:t>
+            </w:r>
+          </w:p>
+        </w:tc>
+        <w:tc>
+          <w:tcPr>
+            <w:tcMar>
+              <w:top w:w="28.34645669291339" w:type="dxa"/>
+              <w:left w:w="28.34645669291339" w:type="dxa"/>
+              <w:bottom w:w="28.34645669291339" w:type="dxa"/>
+              <w:right w:w="28.34645669291339" w:type="dxa"/>
+            </w:tcMar>
+          </w:tcPr>
+          <w:p>
+            <w:pPr>
+              <w:widowControl w:val="0"/>
+              <w:spacing w:line="240" w:lineRule="auto"/>
+              <w:rPr/>
+            </w:pPr>
+            <w:r>
+              <w:rPr>
+                <w:rtl w:val="0"/>
+              </w:rPr>
+            </w:r>
+          </w:p>
+        </w:tc>
+      </w:tr>
+      <w:tr>
+        <w:trPr>
+          <w:cantSplit w:val="1"/>
+          <w:tblHeader w:val="0"/>
+        </w:trPr>
+        <w:tc>
+          <w:tcPr>
+            <w:tcMar>
+              <w:top w:w="28.34645669291339" w:type="dxa"/>
+              <w:left w:w="28.34645669291339" w:type="dxa"/>
+              <w:bottom w:w="28.34645669291339" w:type="dxa"/>
+              <w:right w:w="28.34645669291339" w:type="dxa"/>
+            </w:tcMar>
+          </w:tcPr>
+          <w:p>
+            <w:pPr>
+              <w:widowControl w:val="0"/>
+              <w:spacing w:line="240" w:lineRule="auto"/>
+              <w:rPr>
+                <w:b w:val="1"/>
+                <w:bCs w:val="1"/>
+              </w:rPr>
+            </w:pPr>
+            <w:r>
+              <w:rPr>
+                <w:b w:val="1"/>
+                <w:bCs w:val="1"/>
+                <w:rtl w:val="0"/>
+              </w:rPr>
+              <w:t xml:space="preserve">Que se hará</w:t>
+            </w:r>
+          </w:p>
+        </w:tc>
+        <w:tc>
+          <w:tcPr>
+            <w:tcMar>
+              <w:top w:w="28.34645669291339" w:type="dxa"/>
+              <w:left w:w="28.34645669291339" w:type="dxa"/>
+              <w:bottom w:w="28.34645669291339" w:type="dxa"/>
+              <w:right w:w="28.34645669291339" w:type="dxa"/>
+            </w:tcMar>
+          </w:tcPr>
+          <w:p>
+            <w:pPr>
+              <w:widowControl w:val="0"/>
+              <w:spacing w:line="240" w:lineRule="auto"/>
+              <w:rPr/>
+            </w:pPr>
+            <w:r>
+              <w:rPr>
+                <w:rtl w:val="0"/>
+              </w:rPr>
+            </w:r>
+          </w:p>
+        </w:tc>
+      </w:tr>
+      <w:tr>
+        <w:trPr>
+          <w:cantSplit w:val="1"/>
+          <w:tblHeader w:val="0"/>
+        </w:trPr>
+        <w:tc>
+          <w:tcPr>
+            <w:tcMar>
+              <w:top w:w="28.34645669291339" w:type="dxa"/>
+              <w:left w:w="28.34645669291339" w:type="dxa"/>
+              <w:bottom w:w="28.34645669291339" w:type="dxa"/>
+              <w:right w:w="28.34645669291339" w:type="dxa"/>
+            </w:tcMar>
+          </w:tcPr>
+          <w:p>
+            <w:pPr>
+              <w:widowControl w:val="0"/>
+              <w:spacing w:line="240" w:lineRule="auto"/>
+              <w:rPr>
+                <w:b w:val="1"/>
+                <w:bCs w:val="1"/>
+              </w:rPr>
+            </w:pPr>
+            <w:r>
+              <w:rPr>
+                <w:b w:val="1"/>
+                <w:bCs w:val="1"/>
+                <w:rtl w:val="0"/>
+              </w:rPr>
+              <w:t xml:space="preserve">Impedimentos</w:t>
+            </w:r>
+          </w:p>
+        </w:tc>
+        <w:tc>
+          <w:tcPr>
+            <w:tcMar>
+              <w:top w:w="28.34645669291339" w:type="dxa"/>
+              <w:left w:w="28.34645669291339" w:type="dxa"/>
+              <w:bottom w:w="28.34645669291339" w:type="dxa"/>
+              <w:right w:w="28.34645669291339" w:type="dxa"/>
+            </w:tcMar>
+          </w:tcPr>
+          <w:p>
+            <w:pPr>
+              <w:widowControl w:val="0"/>
+              <w:spacing w:line="240" w:lineRule="auto"/>
+              <w:rPr/>
+            </w:pPr>
+            <w:r>
+              <w:rPr>
+                <w:rtl w:val="0"/>
+              </w:rPr>
+              <w:t xml:space="preserve">No Aplica</w:t>
+            </w:r>
+          </w:p>
+        </w:tc>
+      </w:tr>
+    </w:tbl>
+    <w:p>
+      <w:pPr>
+        <w:rPr/>
+      </w:pPr>
+      <w:r>
+        <w:rPr>
+          <w:rtl w:val="0"/>
+        </w:rPr>
+      </w:r>
+    </w:p>
+    <w:tbl>
+      <w:tblPr>
+        <w:tblStyle w:val="Table48"/>
+        <w:tblW w:w="8503.937007874018" w:type="dxa"/>
+        <w:jc w:val="center"/>
+        <w:tblBorders>
+          <w:top w:color="000000" w:space="0" w:sz="8" w:val="single"/>
+          <w:left w:color="000000" w:space="0" w:sz="8" w:val="single"/>
+          <w:bottom w:color="000000" w:space="0" w:sz="8" w:val="single"/>
+          <w:right w:color="000000" w:space="0" w:sz="8" w:val="single"/>
+          <w:insideH w:color="000000" w:space="0" w:sz="8" w:val="single"/>
+          <w:insideV w:color="000000" w:space="0" w:sz="8" w:val="single"/>
+        </w:tblBorders>
+        <w:tblLayout w:type="fixed"/>
+        <w:tblLook w:val="0600"/>
+      </w:tblPr>
+      <w:tblGrid>
+        <w:gridCol w:w="2267.716535433071"/>
+        <w:gridCol w:w="6236.220472440946"/>
+        <w:tblGridChange w:id="0">
+          <w:tblGrid>
+            <w:gridCol w:w="2267.716535433071"/>
+            <w:gridCol w:w="6236.220472440946"/>
+          </w:tblGrid>
+        </w:tblGridChange>
+      </w:tblGrid>
+      <w:tr>
+        <w:trPr>
+          <w:cantSplit w:val="1"/>
+          <w:tblHeader w:val="0"/>
+        </w:trPr>
+        <w:tc>
+          <w:tcPr>
+            <w:shd w:fill="cfe2f3" w:val="clear"/>
+            <w:tcMar>
+              <w:top w:w="28.34645669291339" w:type="dxa"/>
+              <w:left w:w="28.34645669291339" w:type="dxa"/>
+              <w:bottom w:w="28.34645669291339" w:type="dxa"/>
+              <w:right w:w="28.34645669291339" w:type="dxa"/>
+            </w:tcMar>
+          </w:tcPr>
+          <w:p>
+            <w:pPr>
+              <w:widowControl w:val="0"/>
+              <w:spacing w:line="240" w:lineRule="auto"/>
+              <w:jc w:val="center"/>
+              <w:rPr>
+                <w:b w:val="1"/>
+                <w:bCs w:val="1"/>
+              </w:rPr>
+            </w:pPr>
+            <w:r>
+              <w:rPr>
+                <w:b w:val="1"/>
+                <w:bCs w:val="1"/>
+                <w:rtl w:val="0"/>
+              </w:rPr>
+              <w:t xml:space="preserve">Fecha: 25-10-2026</w:t>
+            </w:r>
+          </w:p>
+        </w:tc>
+        <w:tc>
+          <w:tcPr>
+            <w:shd w:fill="cfe2f3" w:val="clear"/>
+            <w:tcMar>
+              <w:top w:w="28.34645669291339" w:type="dxa"/>
+              <w:left w:w="28.34645669291339" w:type="dxa"/>
+              <w:bottom w:w="28.34645669291339" w:type="dxa"/>
+              <w:right w:w="28.34645669291339" w:type="dxa"/>
+            </w:tcMar>
+          </w:tcPr>
+          <w:p>
+            <w:pPr>
+              <w:widowControl w:val="0"/>
+              <w:spacing w:line="240" w:lineRule="auto"/>
+              <w:rPr>
+                <w:b w:val="1"/>
+                <w:bCs w:val="1"/>
+              </w:rPr>
+            </w:pPr>
+            <w:r>
+              <w:rPr>
+                <w:b w:val="1"/>
+                <w:bCs w:val="1"/>
+                <w:rtl w:val="0"/>
+              </w:rPr>
+              <w:t xml:space="preserve">Sprint: 2</w:t>
+            </w:r>
+          </w:p>
+        </w:tc>
+      </w:tr>
+      <w:tr>
+        <w:trPr>
+          <w:cantSplit w:val="1"/>
+          <w:tblHeader w:val="0"/>
+        </w:trPr>
+        <w:tc>
+          <w:tcPr>
+            <w:tcMar>
+              <w:top w:w="28.34645669291339" w:type="dxa"/>
+              <w:left w:w="28.34645669291339" w:type="dxa"/>
+              <w:bottom w:w="28.34645669291339" w:type="dxa"/>
+              <w:right w:w="28.34645669291339" w:type="dxa"/>
+            </w:tcMar>
+          </w:tcPr>
+          <w:p>
+            <w:pPr>
+              <w:widowControl w:val="0"/>
+              <w:spacing w:line="240" w:lineRule="auto"/>
+              <w:rPr>
+                <w:b w:val="1"/>
+                <w:bCs w:val="1"/>
+              </w:rPr>
+            </w:pPr>
+            <w:r>
+              <w:rPr>
+                <w:b w:val="1"/>
+                <w:bCs w:val="1"/>
+                <w:rtl w:val="0"/>
+              </w:rPr>
+              <w:t xml:space="preserve">Que se hizo</w:t>
+            </w:r>
+          </w:p>
+        </w:tc>
+        <w:tc>
+          <w:tcPr>
+            <w:tcMar>
+              <w:top w:w="28.34645669291339" w:type="dxa"/>
+              <w:left w:w="28.34645669291339" w:type="dxa"/>
+              <w:bottom w:w="28.34645669291339" w:type="dxa"/>
+              <w:right w:w="28.34645669291339" w:type="dxa"/>
+            </w:tcMar>
+          </w:tcPr>
+          <w:p>
+            <w:pPr>
+              <w:widowControl w:val="0"/>
+              <w:spacing w:line="240" w:lineRule="auto"/>
+              <w:rPr/>
+            </w:pPr>
+            <w:r>
+              <w:rPr>
+                <w:rtl w:val="0"/>
+              </w:rPr>
+            </w:r>
+          </w:p>
+        </w:tc>
+      </w:tr>
+      <w:tr>
+        <w:trPr>
+          <w:cantSplit w:val="1"/>
+          <w:tblHeader w:val="0"/>
+        </w:trPr>
+        <w:tc>
+          <w:tcPr>
+            <w:tcMar>
+              <w:top w:w="28.34645669291339" w:type="dxa"/>
+              <w:left w:w="28.34645669291339" w:type="dxa"/>
+              <w:bottom w:w="28.34645669291339" w:type="dxa"/>
+              <w:right w:w="28.34645669291339" w:type="dxa"/>
+            </w:tcMar>
+          </w:tcPr>
+          <w:p>
+            <w:pPr>
+              <w:widowControl w:val="0"/>
+              <w:spacing w:line="240" w:lineRule="auto"/>
+              <w:rPr>
+                <w:b w:val="1"/>
+                <w:bCs w:val="1"/>
+              </w:rPr>
+            </w:pPr>
+            <w:r>
+              <w:rPr>
+                <w:b w:val="1"/>
+                <w:bCs w:val="1"/>
+                <w:rtl w:val="0"/>
+              </w:rPr>
+              <w:t xml:space="preserve">Que se hará</w:t>
+            </w:r>
+          </w:p>
+        </w:tc>
+        <w:tc>
+          <w:tcPr>
+            <w:tcMar>
+              <w:top w:w="28.34645669291339" w:type="dxa"/>
+              <w:left w:w="28.34645669291339" w:type="dxa"/>
+              <w:bottom w:w="28.34645669291339" w:type="dxa"/>
+              <w:right w:w="28.34645669291339" w:type="dxa"/>
+            </w:tcMar>
+          </w:tcPr>
+          <w:p>
+            <w:pPr>
+              <w:widowControl w:val="0"/>
+              <w:spacing w:line="240" w:lineRule="auto"/>
+              <w:rPr/>
+            </w:pPr>
+            <w:r>
+              <w:rPr>
+                <w:rtl w:val="0"/>
+              </w:rPr>
+            </w:r>
+          </w:p>
+        </w:tc>
+      </w:tr>
+      <w:tr>
+        <w:trPr>
+          <w:cantSplit w:val="1"/>
+          <w:tblHeader w:val="0"/>
+        </w:trPr>
+        <w:tc>
+          <w:tcPr>
+            <w:tcMar>
+              <w:top w:w="28.34645669291339" w:type="dxa"/>
+              <w:left w:w="28.34645669291339" w:type="dxa"/>
+              <w:bottom w:w="28.34645669291339" w:type="dxa"/>
+              <w:right w:w="28.34645669291339" w:type="dxa"/>
+            </w:tcMar>
+          </w:tcPr>
+          <w:p>
+            <w:pPr>
+              <w:widowControl w:val="0"/>
+              <w:spacing w:line="240" w:lineRule="auto"/>
+              <w:rPr>
+                <w:b w:val="1"/>
+                <w:bCs w:val="1"/>
+              </w:rPr>
+            </w:pPr>
+            <w:r>
+              <w:rPr>
+                <w:b w:val="1"/>
+                <w:bCs w:val="1"/>
+                <w:rtl w:val="0"/>
+              </w:rPr>
+              <w:t xml:space="preserve">Impedimentos</w:t>
+            </w:r>
+          </w:p>
+        </w:tc>
+        <w:tc>
+          <w:tcPr>
+            <w:tcMar>
+              <w:top w:w="28.34645669291339" w:type="dxa"/>
+              <w:left w:w="28.34645669291339" w:type="dxa"/>
+              <w:bottom w:w="28.34645669291339" w:type="dxa"/>
+              <w:right w:w="28.34645669291339" w:type="dxa"/>
+            </w:tcMar>
+          </w:tcPr>
+          <w:p>
+            <w:pPr>
+              <w:widowControl w:val="0"/>
+              <w:spacing w:line="240" w:lineRule="auto"/>
+              <w:rPr/>
+            </w:pPr>
+            <w:r>
+              <w:rPr>
+                <w:rtl w:val="0"/>
+              </w:rPr>
+              <w:t xml:space="preserve">No Aplica</w:t>
+            </w:r>
+          </w:p>
+        </w:tc>
+      </w:tr>
+    </w:tbl>
+    <w:p>
+      <w:pPr>
+        <w:rPr/>
+      </w:pPr>
+      <w:r>
+        <w:rPr>
+          <w:rtl w:val="0"/>
+        </w:rPr>
+      </w:r>
+    </w:p>
     <w:p>
       <w:pPr>
         <w:rPr/>
@@ -11523,7 +13459,7 @@
     </w:p>
     <w:tbl>
       <w:tblPr>
-        <w:tblStyle w:val="Table42"/>
+        <w:tblStyle w:val="Table49"/>
         <w:tblW w:w="8503.937007874018" w:type="dxa"/>
         <w:jc w:val="center"/>
         <w:tblBorders>
@@ -11794,7 +13730,7 @@
     </w:p>
     <w:tbl>
       <w:tblPr>
-        <w:tblStyle w:val="Table43"/>
+        <w:tblStyle w:val="Table50"/>
         <w:tblW w:w="8503.937007874018" w:type="dxa"/>
         <w:jc w:val="center"/>
         <w:tblBorders>
@@ -12576,6 +14512,55 @@
       <w:tblStyleColBandSize w:val="1"/>
     </w:tblPr>
   </w:style>
+  <w:style w:type="table" w:styleId="Table44">
+    <w:basedOn w:val="TableNormal"/>
+    <w:tblPr>
+      <w:tblStyleRowBandSize w:val="1"/>
+      <w:tblStyleColBandSize w:val="1"/>
+    </w:tblPr>
+  </w:style>
+  <w:style w:type="table" w:styleId="Table45">
+    <w:basedOn w:val="TableNormal"/>
+    <w:tblPr>
+      <w:tblStyleRowBandSize w:val="1"/>
+      <w:tblStyleColBandSize w:val="1"/>
+    </w:tblPr>
+  </w:style>
+  <w:style w:type="table" w:styleId="Table46">
+    <w:basedOn w:val="TableNormal"/>
+    <w:tblPr>
+      <w:tblStyleRowBandSize w:val="1"/>
+      <w:tblStyleColBandSize w:val="1"/>
+    </w:tblPr>
+  </w:style>
+  <w:style w:type="table" w:styleId="Table47">
+    <w:basedOn w:val="TableNormal"/>
+    <w:tblPr>
+      <w:tblStyleRowBandSize w:val="1"/>
+      <w:tblStyleColBandSize w:val="1"/>
+    </w:tblPr>
+  </w:style>
+  <w:style w:type="table" w:styleId="Table48">
+    <w:basedOn w:val="TableNormal"/>
+    <w:tblPr>
+      <w:tblStyleRowBandSize w:val="1"/>
+      <w:tblStyleColBandSize w:val="1"/>
+    </w:tblPr>
+  </w:style>
+  <w:style w:type="table" w:styleId="Table49">
+    <w:basedOn w:val="TableNormal"/>
+    <w:tblPr>
+      <w:tblStyleRowBandSize w:val="1"/>
+      <w:tblStyleColBandSize w:val="1"/>
+    </w:tblPr>
+  </w:style>
+  <w:style w:type="table" w:styleId="Table50">
+    <w:basedOn w:val="TableNormal"/>
+    <w:tblPr>
+      <w:tblStyleRowBandSize w:val="1"/>
+      <w:tblStyleColBandSize w:val="1"/>
+    </w:tblPr>
+  </w:style>
 </w:styles>
 </file>
 

</xml_diff>